<commit_message>
TS 6.1 Kramam Tamil and Sanskrit
</commit_message>
<xml_diff>
--- a/TS-Kramam/TS-6.1/TS 6.1 Sanskrit Krama Paatam Corrections.docx
+++ b/TS-Kramam/TS-6.1/TS 6.1 Sanskrit Krama Paatam Corrections.docx
@@ -81,7 +81,18 @@
           <w:szCs w:val="32"/>
           <w:u w:val="single"/>
         </w:rPr>
-        <w:t xml:space="preserve">Observed till </w:t>
+        <w:t xml:space="preserve">Observed </w:t>
+      </w:r>
+      <w:proofErr w:type="gramStart"/>
+      <w:r>
+        <w:rPr>
+          <w:b/>
+          <w:bCs/>
+          <w:sz w:val="32"/>
+          <w:szCs w:val="32"/>
+          <w:u w:val="single"/>
+        </w:rPr>
+        <w:t xml:space="preserve">till </w:t>
       </w:r>
       <w:r>
         <w:rPr>
@@ -94,6 +105,7 @@
         </w:rPr>
         <w:t>???</w:t>
       </w:r>
+      <w:proofErr w:type="gramEnd"/>
     </w:p>
     <w:p>
       <w:pPr>
@@ -1504,6 +1516,8 @@
                 <w:lang w:val="it-IT"/>
               </w:rPr>
             </w:pPr>
+            <w:proofErr w:type="spellStart"/>
+            <w:proofErr w:type="gramStart"/>
             <w:r>
               <w:rPr>
                 <w:rFonts w:ascii="BRH Devanagari Extra" w:hAnsi="BRH Devanagari Extra" w:cs="BRH Devanagari Extra"/>
@@ -1513,6 +1527,7 @@
               </w:rPr>
               <w:t>iÉåÿ</w:t>
             </w:r>
+            <w:proofErr w:type="spellEnd"/>
             <w:r>
               <w:rPr>
                 <w:rFonts w:ascii="BRH Devanagari Extra" w:hAnsi="BRH Devanagari Extra" w:cs="BRH Devanagari Extra"/>
@@ -1523,6 +1538,7 @@
               </w:rPr>
               <w:t>(</w:t>
             </w:r>
+            <w:proofErr w:type="gramEnd"/>
             <w:r>
               <w:rPr>
                 <w:rFonts w:cs="BRH Devanagari Extra"/>
@@ -1534,6 +1550,7 @@
               </w:rPr>
               <w:t>1</w:t>
             </w:r>
+            <w:proofErr w:type="gramStart"/>
             <w:r>
               <w:rPr>
                 <w:rFonts w:ascii="BRH Malayalam Extra" w:hAnsi="BRH Malayalam Extra" w:cs="BRH Devanagari Extra"/>
@@ -1552,8 +1569,21 @@
                 <w:szCs w:val="40"/>
                 <w:highlight w:val="yellow"/>
               </w:rPr>
-              <w:t>)ÅlrÉþÈ</w:t>
-            </w:r>
+              <w:t>)</w:t>
+            </w:r>
+            <w:proofErr w:type="spellStart"/>
+            <w:r>
+              <w:rPr>
+                <w:rFonts w:ascii="BRH Devanagari Extra" w:hAnsi="BRH Devanagari Extra" w:cs="BRH Devanagari Extra"/>
+                <w:color w:val="000000"/>
+                <w:sz w:val="40"/>
+                <w:szCs w:val="40"/>
+                <w:highlight w:val="yellow"/>
+              </w:rPr>
+              <w:t>ÅlrÉþÈ</w:t>
+            </w:r>
+            <w:proofErr w:type="spellEnd"/>
+            <w:proofErr w:type="gramEnd"/>
             <w:r>
               <w:rPr>
                 <w:rFonts w:ascii="BRH Devanagari Extra" w:hAnsi="BRH Devanagari Extra" w:cs="BRH Devanagari Extra"/>
@@ -1572,14 +1602,25 @@
               </w:rPr>
               <w:t>–</w:t>
             </w:r>
-            <w:r>
-              <w:rPr>
-                <w:rFonts w:ascii="BRH Devanagari Extra" w:hAnsi="BRH Devanagari Extra" w:cs="BRH Devanagari Extra"/>
-                <w:color w:val="000000"/>
-                <w:sz w:val="40"/>
-                <w:szCs w:val="40"/>
-              </w:rPr>
-              <w:t>lrÉÉåÿÅlrÉqÉç |</w:t>
+            <w:proofErr w:type="spellStart"/>
+            <w:r>
+              <w:rPr>
+                <w:rFonts w:ascii="BRH Devanagari Extra" w:hAnsi="BRH Devanagari Extra" w:cs="BRH Devanagari Extra"/>
+                <w:color w:val="000000"/>
+                <w:sz w:val="40"/>
+                <w:szCs w:val="40"/>
+              </w:rPr>
+              <w:t>lrÉÉåÿÅlrÉqÉç</w:t>
+            </w:r>
+            <w:proofErr w:type="spellEnd"/>
+            <w:r>
+              <w:rPr>
+                <w:rFonts w:ascii="BRH Devanagari Extra" w:hAnsi="BRH Devanagari Extra" w:cs="BRH Devanagari Extra"/>
+                <w:color w:val="000000"/>
+                <w:sz w:val="40"/>
+                <w:szCs w:val="40"/>
+              </w:rPr>
+              <w:t xml:space="preserve"> |</w:t>
             </w:r>
           </w:p>
         </w:tc>
@@ -1602,6 +1643,7 @@
                 <w:lang w:val="it-IT"/>
               </w:rPr>
             </w:pPr>
+            <w:proofErr w:type="spellStart"/>
             <w:r>
               <w:rPr>
                 <w:rFonts w:ascii="BRH Devanagari Extra" w:hAnsi="BRH Devanagari Extra" w:cs="BRH Devanagari Extra"/>
@@ -1621,6 +1663,7 @@
               </w:rPr>
               <w:t>ÿÅlrÉÈ</w:t>
             </w:r>
+            <w:proofErr w:type="spellEnd"/>
             <w:r>
               <w:rPr>
                 <w:rFonts w:ascii="BRH Devanagari Extra" w:hAnsi="BRH Devanagari Extra" w:cs="BRH Devanagari Extra"/>
@@ -1639,14 +1682,951 @@
               </w:rPr>
               <w:t>–</w:t>
             </w:r>
-            <w:r>
-              <w:rPr>
-                <w:rFonts w:ascii="BRH Devanagari Extra" w:hAnsi="BRH Devanagari Extra" w:cs="BRH Devanagari Extra"/>
-                <w:color w:val="000000"/>
-                <w:sz w:val="40"/>
-                <w:szCs w:val="40"/>
-              </w:rPr>
-              <w:t>lrÉÉåÿÅlrÉqÉç |</w:t>
+            <w:proofErr w:type="spellStart"/>
+            <w:r>
+              <w:rPr>
+                <w:rFonts w:ascii="BRH Devanagari Extra" w:hAnsi="BRH Devanagari Extra" w:cs="BRH Devanagari Extra"/>
+                <w:color w:val="000000"/>
+                <w:sz w:val="40"/>
+                <w:szCs w:val="40"/>
+              </w:rPr>
+              <w:t>lrÉÉåÿÅlrÉqÉç</w:t>
+            </w:r>
+            <w:proofErr w:type="spellEnd"/>
+            <w:r>
+              <w:rPr>
+                <w:rFonts w:ascii="BRH Devanagari Extra" w:hAnsi="BRH Devanagari Extra" w:cs="BRH Devanagari Extra"/>
+                <w:color w:val="000000"/>
+                <w:sz w:val="40"/>
+                <w:szCs w:val="40"/>
+              </w:rPr>
+              <w:t xml:space="preserve"> |</w:t>
+            </w:r>
+          </w:p>
+        </w:tc>
+      </w:tr>
+      <w:tr>
+        <w:trPr>
+          <w:trHeight w:val="964"/>
+        </w:trPr>
+        <w:tc>
+          <w:tcPr>
+            <w:tcW w:w="3877" w:type="dxa"/>
+          </w:tcPr>
+          <w:p>
+            <w:pPr>
+              <w:widowControl w:val="0"/>
+              <w:tabs>
+                <w:tab w:val="left" w:pos="993"/>
+              </w:tabs>
+              <w:autoSpaceDE w:val="0"/>
+              <w:autoSpaceDN w:val="0"/>
+              <w:adjustRightInd w:val="0"/>
+              <w:spacing w:before="0" w:line="252" w:lineRule="auto"/>
+              <w:ind w:right="297"/>
+              <w:rPr>
+                <w:rFonts w:cs="Arial"/>
+                <w:b/>
+                <w:color w:val="000000"/>
+                <w:sz w:val="28"/>
+                <w:szCs w:val="28"/>
+              </w:rPr>
+            </w:pPr>
+            <w:r>
+              <w:rPr>
+                <w:rFonts w:cs="Arial"/>
+                <w:b/>
+                <w:color w:val="000000"/>
+                <w:sz w:val="28"/>
+                <w:szCs w:val="28"/>
+              </w:rPr>
+              <w:t>T.S.6.1.</w:t>
+            </w:r>
+            <w:r>
+              <w:rPr>
+                <w:rFonts w:cs="Arial"/>
+                <w:b/>
+                <w:color w:val="000000"/>
+                <w:sz w:val="28"/>
+                <w:szCs w:val="28"/>
+              </w:rPr>
+              <w:t>6</w:t>
+            </w:r>
+            <w:r>
+              <w:rPr>
+                <w:rFonts w:cs="Arial"/>
+                <w:b/>
+                <w:color w:val="000000"/>
+                <w:sz w:val="28"/>
+                <w:szCs w:val="28"/>
+              </w:rPr>
+              <w:t>.</w:t>
+            </w:r>
+            <w:r>
+              <w:rPr>
+                <w:rFonts w:cs="Arial"/>
+                <w:b/>
+                <w:color w:val="000000"/>
+                <w:sz w:val="28"/>
+                <w:szCs w:val="28"/>
+              </w:rPr>
+              <w:t>7</w:t>
+            </w:r>
+            <w:r>
+              <w:rPr>
+                <w:rFonts w:cs="Arial"/>
+                <w:b/>
+                <w:color w:val="000000"/>
+                <w:sz w:val="28"/>
+                <w:szCs w:val="28"/>
+              </w:rPr>
+              <w:t xml:space="preserve"> – Kramam</w:t>
+            </w:r>
+          </w:p>
+          <w:p>
+            <w:pPr>
+              <w:widowControl w:val="0"/>
+              <w:tabs>
+                <w:tab w:val="left" w:pos="993"/>
+              </w:tabs>
+              <w:autoSpaceDE w:val="0"/>
+              <w:autoSpaceDN w:val="0"/>
+              <w:adjustRightInd w:val="0"/>
+              <w:spacing w:before="0" w:line="252" w:lineRule="auto"/>
+              <w:ind w:right="297"/>
+              <w:rPr>
+                <w:rFonts w:cs="Arial"/>
+                <w:b/>
+                <w:color w:val="000000"/>
+                <w:sz w:val="28"/>
+                <w:szCs w:val="28"/>
+                <w:lang w:val="en-IN"/>
+              </w:rPr>
+            </w:pPr>
+            <w:r>
+              <w:rPr>
+                <w:rFonts w:cs="Arial"/>
+                <w:b/>
+                <w:color w:val="000000"/>
+                <w:sz w:val="28"/>
+                <w:szCs w:val="28"/>
+                <w:lang w:val="en-IN"/>
+              </w:rPr>
+              <w:t xml:space="preserve">Krama Vaakyam No.– </w:t>
+            </w:r>
+            <w:r>
+              <w:rPr>
+                <w:rFonts w:cs="Arial"/>
+                <w:b/>
+                <w:color w:val="000000"/>
+                <w:sz w:val="28"/>
+                <w:szCs w:val="28"/>
+                <w:lang w:val="en-IN"/>
+              </w:rPr>
+              <w:t>43</w:t>
+            </w:r>
+          </w:p>
+          <w:p>
+            <w:pPr>
+              <w:widowControl w:val="0"/>
+              <w:tabs>
+                <w:tab w:val="left" w:pos="993"/>
+              </w:tabs>
+              <w:autoSpaceDE w:val="0"/>
+              <w:autoSpaceDN w:val="0"/>
+              <w:adjustRightInd w:val="0"/>
+              <w:spacing w:before="0" w:line="252" w:lineRule="auto"/>
+              <w:ind w:right="297"/>
+              <w:rPr>
+                <w:rFonts w:cs="Arial"/>
+                <w:b/>
+                <w:color w:val="000000"/>
+                <w:sz w:val="28"/>
+                <w:szCs w:val="32"/>
+              </w:rPr>
+            </w:pPr>
+            <w:r>
+              <w:rPr>
+                <w:rFonts w:cs="Arial"/>
+                <w:b/>
+                <w:color w:val="000000"/>
+                <w:sz w:val="28"/>
+                <w:szCs w:val="28"/>
+                <w:lang w:val="it-IT"/>
+              </w:rPr>
+              <w:t xml:space="preserve">Panchaati No. - </w:t>
+            </w:r>
+            <w:r>
+              <w:rPr>
+                <w:rFonts w:cs="Arial"/>
+                <w:b/>
+                <w:color w:val="000000"/>
+                <w:sz w:val="28"/>
+                <w:szCs w:val="28"/>
+                <w:lang w:val="it-IT"/>
+              </w:rPr>
+              <w:t>45</w:t>
+            </w:r>
+          </w:p>
+        </w:tc>
+        <w:tc>
+          <w:tcPr>
+            <w:tcW w:w="4738" w:type="dxa"/>
+          </w:tcPr>
+          <w:p>
+            <w:pPr>
+              <w:widowControl w:val="0"/>
+              <w:autoSpaceDE w:val="0"/>
+              <w:autoSpaceDN w:val="0"/>
+              <w:adjustRightInd w:val="0"/>
+              <w:spacing w:before="0" w:line="240" w:lineRule="auto"/>
+              <w:rPr>
+                <w:rFonts w:ascii="BRH Devanagari Extra" w:hAnsi="BRH Devanagari Extra" w:cs="BRH Devanagari Extra"/>
+                <w:color w:val="000000"/>
+                <w:sz w:val="40"/>
+                <w:szCs w:val="40"/>
+              </w:rPr>
+            </w:pPr>
+            <w:proofErr w:type="spellStart"/>
+            <w:r>
+              <w:rPr>
+                <w:rFonts w:ascii="BRH Devanagari Extra" w:hAnsi="BRH Devanagari Extra" w:cs="BRH Devanagari Extra"/>
+                <w:color w:val="000000"/>
+                <w:sz w:val="40"/>
+                <w:szCs w:val="40"/>
+              </w:rPr>
+              <w:t>rÉSè</w:t>
+            </w:r>
+            <w:proofErr w:type="spellEnd"/>
+            <w:r>
+              <w:rPr>
+                <w:rFonts w:ascii="BRH Devanagari Extra" w:hAnsi="BRH Devanagari Extra" w:cs="BRH Devanagari Extra"/>
+                <w:color w:val="000000"/>
+                <w:sz w:val="40"/>
+                <w:szCs w:val="40"/>
+              </w:rPr>
+              <w:t xml:space="preserve"> </w:t>
+            </w:r>
+            <w:proofErr w:type="spellStart"/>
+            <w:r>
+              <w:rPr>
+                <w:rFonts w:ascii="BRH Devanagari Extra" w:hAnsi="BRH Devanagari Extra" w:cs="BRH Devanagari Extra"/>
+                <w:color w:val="000000"/>
+                <w:sz w:val="40"/>
+                <w:szCs w:val="40"/>
+                <w:highlight w:val="yellow"/>
+              </w:rPr>
+              <w:t>ÌuÉ</w:t>
+            </w:r>
+            <w:r>
+              <w:rPr>
+                <w:rFonts w:ascii="BRH Devanagari Extra" w:hAnsi="BRH Devanagari Extra" w:cs="BRH Devanagari Extra"/>
+                <w:color w:val="000000"/>
+                <w:sz w:val="40"/>
+                <w:szCs w:val="40"/>
+              </w:rPr>
+              <w:t>þÃ</w:t>
+            </w:r>
+            <w:proofErr w:type="spellEnd"/>
+            <w:r>
+              <w:rPr>
+                <w:rFonts w:ascii="BRH Malayalam Extra" w:hAnsi="BRH Malayalam Extra" w:cs="BRH Devanagari Extra"/>
+                <w:color w:val="000000"/>
+                <w:sz w:val="32"/>
+                <w:szCs w:val="40"/>
+              </w:rPr>
+              <w:t>–</w:t>
+            </w:r>
+            <w:proofErr w:type="spellStart"/>
+            <w:r>
+              <w:rPr>
+                <w:rFonts w:ascii="BRH Devanagari Extra" w:hAnsi="BRH Devanagari Extra" w:cs="BRH Devanagari Extra"/>
+                <w:color w:val="000000"/>
+                <w:sz w:val="40"/>
+                <w:szCs w:val="40"/>
+              </w:rPr>
+              <w:t>mÉrÉÉÿ</w:t>
+            </w:r>
+            <w:proofErr w:type="spellEnd"/>
+            <w:r>
+              <w:rPr>
+                <w:rFonts w:ascii="BRH Devanagari Extra" w:hAnsi="BRH Devanagari Extra" w:cs="BRH Devanagari Extra"/>
+                <w:color w:val="000000"/>
+                <w:sz w:val="40"/>
+                <w:szCs w:val="40"/>
+              </w:rPr>
+              <w:t xml:space="preserve"> | Ì²</w:t>
+            </w:r>
+            <w:r>
+              <w:rPr>
+                <w:rFonts w:ascii="BRH Malayalam Extra" w:hAnsi="BRH Malayalam Extra" w:cs="BRH Devanagari Extra"/>
+                <w:color w:val="000000"/>
+                <w:sz w:val="32"/>
+                <w:szCs w:val="40"/>
+              </w:rPr>
+              <w:t>–</w:t>
+            </w:r>
+            <w:r>
+              <w:rPr>
+                <w:rFonts w:ascii="BRH Devanagari Extra" w:hAnsi="BRH Devanagari Extra" w:cs="BRH Devanagari Extra"/>
+                <w:color w:val="000000"/>
+                <w:sz w:val="40"/>
+                <w:szCs w:val="40"/>
+              </w:rPr>
+              <w:t>Ã</w:t>
+            </w:r>
+            <w:r>
+              <w:rPr>
+                <w:rFonts w:ascii="BRH Malayalam Extra" w:hAnsi="BRH Malayalam Extra" w:cs="BRH Devanagari Extra"/>
+                <w:color w:val="000000"/>
+                <w:sz w:val="32"/>
+                <w:szCs w:val="40"/>
+              </w:rPr>
+              <w:t>–</w:t>
+            </w:r>
+            <w:proofErr w:type="spellStart"/>
+            <w:r>
+              <w:rPr>
+                <w:rFonts w:ascii="BRH Devanagari Extra" w:hAnsi="BRH Devanagari Extra" w:cs="BRH Devanagari Extra"/>
+                <w:color w:val="000000"/>
+                <w:sz w:val="40"/>
+                <w:szCs w:val="40"/>
+              </w:rPr>
+              <w:t>mÉrÉÉ</w:t>
+            </w:r>
+            <w:proofErr w:type="spellEnd"/>
+            <w:r>
+              <w:rPr>
+                <w:rFonts w:ascii="BRH Malayalam Extra" w:hAnsi="BRH Malayalam Extra" w:cs="BRH Devanagari Extra"/>
+                <w:color w:val="000000"/>
+                <w:sz w:val="32"/>
+                <w:szCs w:val="40"/>
+              </w:rPr>
+              <w:t>–</w:t>
+            </w:r>
+            <w:r>
+              <w:rPr>
+                <w:rFonts w:ascii="BRH Devanagari Extra" w:hAnsi="BRH Devanagari Extra" w:cs="BRH Devanagari Extra"/>
+                <w:color w:val="000000"/>
+                <w:sz w:val="40"/>
+                <w:szCs w:val="40"/>
+              </w:rPr>
+              <w:t xml:space="preserve"> </w:t>
+            </w:r>
+            <w:proofErr w:type="spellStart"/>
+            <w:r>
+              <w:rPr>
+                <w:rFonts w:ascii="BRH Devanagari Extra" w:hAnsi="BRH Devanagari Extra" w:cs="BRH Devanagari Extra"/>
+                <w:color w:val="000000"/>
+                <w:sz w:val="40"/>
+                <w:szCs w:val="40"/>
+              </w:rPr>
+              <w:t>uÉÉ§ÉïþblÉÏ</w:t>
+            </w:r>
+            <w:proofErr w:type="spellEnd"/>
+            <w:r>
+              <w:rPr>
+                <w:rFonts w:ascii="BRH Devanagari Extra" w:hAnsi="BRH Devanagari Extra" w:cs="BRH Devanagari Extra"/>
+                <w:color w:val="000000"/>
+                <w:sz w:val="40"/>
+                <w:szCs w:val="40"/>
+              </w:rPr>
+              <w:t xml:space="preserve"> </w:t>
+            </w:r>
+          </w:p>
+        </w:tc>
+        <w:tc>
+          <w:tcPr>
+            <w:tcW w:w="5220" w:type="dxa"/>
+          </w:tcPr>
+          <w:p>
+            <w:pPr>
+              <w:widowControl w:val="0"/>
+              <w:autoSpaceDE w:val="0"/>
+              <w:autoSpaceDN w:val="0"/>
+              <w:adjustRightInd w:val="0"/>
+              <w:spacing w:before="0" w:line="240" w:lineRule="auto"/>
+              <w:rPr>
+                <w:rFonts w:ascii="BRH Devanagari Extra" w:hAnsi="BRH Devanagari Extra" w:cs="BRH Devanagari Extra"/>
+                <w:color w:val="000000"/>
+                <w:sz w:val="40"/>
+                <w:szCs w:val="40"/>
+              </w:rPr>
+            </w:pPr>
+            <w:proofErr w:type="spellStart"/>
+            <w:r>
+              <w:rPr>
+                <w:rFonts w:ascii="BRH Devanagari Extra" w:hAnsi="BRH Devanagari Extra" w:cs="BRH Devanagari Extra"/>
+                <w:color w:val="000000"/>
+                <w:sz w:val="40"/>
+                <w:szCs w:val="40"/>
+              </w:rPr>
+              <w:t>rÉSè</w:t>
+            </w:r>
+            <w:proofErr w:type="spellEnd"/>
+            <w:r>
+              <w:rPr>
+                <w:rFonts w:ascii="BRH Devanagari Extra" w:hAnsi="BRH Devanagari Extra" w:cs="BRH Devanagari Extra"/>
+                <w:color w:val="000000"/>
+                <w:sz w:val="40"/>
+                <w:szCs w:val="40"/>
+              </w:rPr>
+              <w:t xml:space="preserve"> </w:t>
+            </w:r>
+            <w:r>
+              <w:rPr>
+                <w:rFonts w:ascii="BRH Devanagari Extra" w:hAnsi="BRH Devanagari Extra" w:cs="BRH Devanagari Extra"/>
+                <w:color w:val="000000"/>
+                <w:sz w:val="40"/>
+                <w:szCs w:val="40"/>
+                <w:highlight w:val="green"/>
+              </w:rPr>
+              <w:t>Ì²þ</w:t>
+            </w:r>
+            <w:r>
+              <w:rPr>
+                <w:rFonts w:ascii="BRH Devanagari Extra" w:hAnsi="BRH Devanagari Extra" w:cs="BRH Devanagari Extra"/>
+                <w:color w:val="000000"/>
+                <w:sz w:val="40"/>
+                <w:szCs w:val="40"/>
+              </w:rPr>
+              <w:t>Ã</w:t>
+            </w:r>
+            <w:r>
+              <w:rPr>
+                <w:rFonts w:ascii="BRH Malayalam Extra" w:hAnsi="BRH Malayalam Extra" w:cs="BRH Devanagari Extra"/>
+                <w:color w:val="000000"/>
+                <w:sz w:val="32"/>
+                <w:szCs w:val="40"/>
+              </w:rPr>
+              <w:t>–</w:t>
+            </w:r>
+            <w:proofErr w:type="spellStart"/>
+            <w:r>
+              <w:rPr>
+                <w:rFonts w:ascii="BRH Devanagari Extra" w:hAnsi="BRH Devanagari Extra" w:cs="BRH Devanagari Extra"/>
+                <w:color w:val="000000"/>
+                <w:sz w:val="40"/>
+                <w:szCs w:val="40"/>
+              </w:rPr>
+              <w:t>mÉrÉÉÿ</w:t>
+            </w:r>
+            <w:proofErr w:type="spellEnd"/>
+            <w:r>
+              <w:rPr>
+                <w:rFonts w:ascii="BRH Devanagari Extra" w:hAnsi="BRH Devanagari Extra" w:cs="BRH Devanagari Extra"/>
+                <w:color w:val="000000"/>
+                <w:sz w:val="40"/>
+                <w:szCs w:val="40"/>
+              </w:rPr>
+              <w:t xml:space="preserve"> | Ì²</w:t>
+            </w:r>
+            <w:r>
+              <w:rPr>
+                <w:rFonts w:ascii="BRH Malayalam Extra" w:hAnsi="BRH Malayalam Extra" w:cs="BRH Devanagari Extra"/>
+                <w:color w:val="000000"/>
+                <w:sz w:val="32"/>
+                <w:szCs w:val="40"/>
+              </w:rPr>
+              <w:t>–</w:t>
+            </w:r>
+            <w:r>
+              <w:rPr>
+                <w:rFonts w:ascii="BRH Devanagari Extra" w:hAnsi="BRH Devanagari Extra" w:cs="BRH Devanagari Extra"/>
+                <w:color w:val="000000"/>
+                <w:sz w:val="40"/>
+                <w:szCs w:val="40"/>
+              </w:rPr>
+              <w:t>Ã</w:t>
+            </w:r>
+            <w:r>
+              <w:rPr>
+                <w:rFonts w:ascii="BRH Malayalam Extra" w:hAnsi="BRH Malayalam Extra" w:cs="BRH Devanagari Extra"/>
+                <w:color w:val="000000"/>
+                <w:sz w:val="32"/>
+                <w:szCs w:val="40"/>
+              </w:rPr>
+              <w:t>–</w:t>
+            </w:r>
+            <w:proofErr w:type="spellStart"/>
+            <w:r>
+              <w:rPr>
+                <w:rFonts w:ascii="BRH Devanagari Extra" w:hAnsi="BRH Devanagari Extra" w:cs="BRH Devanagari Extra"/>
+                <w:color w:val="000000"/>
+                <w:sz w:val="40"/>
+                <w:szCs w:val="40"/>
+              </w:rPr>
+              <w:t>mÉrÉÉ</w:t>
+            </w:r>
+            <w:proofErr w:type="spellEnd"/>
+            <w:r>
+              <w:rPr>
+                <w:rFonts w:ascii="BRH Malayalam Extra" w:hAnsi="BRH Malayalam Extra" w:cs="BRH Devanagari Extra"/>
+                <w:color w:val="000000"/>
+                <w:sz w:val="32"/>
+                <w:szCs w:val="40"/>
+              </w:rPr>
+              <w:t>–</w:t>
+            </w:r>
+            <w:r>
+              <w:rPr>
+                <w:rFonts w:ascii="BRH Devanagari Extra" w:hAnsi="BRH Devanagari Extra" w:cs="BRH Devanagari Extra"/>
+                <w:color w:val="000000"/>
+                <w:sz w:val="40"/>
+                <w:szCs w:val="40"/>
+              </w:rPr>
+              <w:t xml:space="preserve"> </w:t>
+            </w:r>
+            <w:proofErr w:type="spellStart"/>
+            <w:r>
+              <w:rPr>
+                <w:rFonts w:ascii="BRH Devanagari Extra" w:hAnsi="BRH Devanagari Extra" w:cs="BRH Devanagari Extra"/>
+                <w:color w:val="000000"/>
+                <w:sz w:val="40"/>
+                <w:szCs w:val="40"/>
+              </w:rPr>
+              <w:t>uÉÉ§ÉïþblÉÏ</w:t>
+            </w:r>
+            <w:proofErr w:type="spellEnd"/>
+          </w:p>
+        </w:tc>
+      </w:tr>
+      <w:tr>
+        <w:trPr>
+          <w:trHeight w:val="964"/>
+        </w:trPr>
+        <w:tc>
+          <w:tcPr>
+            <w:tcW w:w="3877" w:type="dxa"/>
+          </w:tcPr>
+          <w:p>
+            <w:pPr>
+              <w:widowControl w:val="0"/>
+              <w:tabs>
+                <w:tab w:val="left" w:pos="993"/>
+              </w:tabs>
+              <w:autoSpaceDE w:val="0"/>
+              <w:autoSpaceDN w:val="0"/>
+              <w:adjustRightInd w:val="0"/>
+              <w:spacing w:before="0" w:line="252" w:lineRule="auto"/>
+              <w:ind w:right="297"/>
+              <w:rPr>
+                <w:rFonts w:cs="Arial"/>
+                <w:b/>
+                <w:color w:val="000000"/>
+                <w:sz w:val="28"/>
+                <w:szCs w:val="28"/>
+              </w:rPr>
+            </w:pPr>
+            <w:r>
+              <w:rPr>
+                <w:rFonts w:cs="Arial"/>
+                <w:b/>
+                <w:color w:val="000000"/>
+                <w:sz w:val="28"/>
+                <w:szCs w:val="28"/>
+              </w:rPr>
+              <w:t>T.S.6.1.</w:t>
+            </w:r>
+            <w:r>
+              <w:rPr>
+                <w:rFonts w:cs="Arial"/>
+                <w:b/>
+                <w:color w:val="000000"/>
+                <w:sz w:val="28"/>
+                <w:szCs w:val="28"/>
+              </w:rPr>
+              <w:t>8</w:t>
+            </w:r>
+            <w:r>
+              <w:rPr>
+                <w:rFonts w:cs="Arial"/>
+                <w:b/>
+                <w:color w:val="000000"/>
+                <w:sz w:val="28"/>
+                <w:szCs w:val="28"/>
+              </w:rPr>
+              <w:t>.</w:t>
+            </w:r>
+            <w:r>
+              <w:rPr>
+                <w:rFonts w:cs="Arial"/>
+                <w:b/>
+                <w:color w:val="000000"/>
+                <w:sz w:val="28"/>
+                <w:szCs w:val="28"/>
+              </w:rPr>
+              <w:t>3</w:t>
+            </w:r>
+            <w:r>
+              <w:rPr>
+                <w:rFonts w:cs="Arial"/>
+                <w:b/>
+                <w:color w:val="000000"/>
+                <w:sz w:val="28"/>
+                <w:szCs w:val="28"/>
+              </w:rPr>
+              <w:t xml:space="preserve"> – Kramam</w:t>
+            </w:r>
+          </w:p>
+          <w:p>
+            <w:pPr>
+              <w:widowControl w:val="0"/>
+              <w:tabs>
+                <w:tab w:val="left" w:pos="993"/>
+              </w:tabs>
+              <w:autoSpaceDE w:val="0"/>
+              <w:autoSpaceDN w:val="0"/>
+              <w:adjustRightInd w:val="0"/>
+              <w:spacing w:before="0" w:line="252" w:lineRule="auto"/>
+              <w:ind w:right="297"/>
+              <w:rPr>
+                <w:rFonts w:cstheme="minorBidi" w:hint="cs"/>
+                <w:b/>
+                <w:color w:val="000000"/>
+                <w:sz w:val="28"/>
+                <w:szCs w:val="28"/>
+                <w:lang w:val="en-IN" w:bidi="ta-IN"/>
+              </w:rPr>
+            </w:pPr>
+            <w:r>
+              <w:rPr>
+                <w:rFonts w:cs="Arial"/>
+                <w:b/>
+                <w:color w:val="000000"/>
+                <w:sz w:val="28"/>
+                <w:szCs w:val="28"/>
+                <w:lang w:val="en-IN"/>
+              </w:rPr>
+              <w:t xml:space="preserve">Krama Vaakyam No.– </w:t>
+            </w:r>
+            <w:r>
+              <w:rPr>
+                <w:rFonts w:cs="Arial"/>
+                <w:b/>
+                <w:color w:val="000000"/>
+                <w:sz w:val="28"/>
+                <w:szCs w:val="28"/>
+                <w:lang w:val="en-IN"/>
+              </w:rPr>
+              <w:t>4, 5</w:t>
+            </w:r>
+          </w:p>
+          <w:p>
+            <w:pPr>
+              <w:widowControl w:val="0"/>
+              <w:tabs>
+                <w:tab w:val="left" w:pos="993"/>
+              </w:tabs>
+              <w:autoSpaceDE w:val="0"/>
+              <w:autoSpaceDN w:val="0"/>
+              <w:adjustRightInd w:val="0"/>
+              <w:spacing w:before="0" w:line="252" w:lineRule="auto"/>
+              <w:ind w:right="297"/>
+              <w:rPr>
+                <w:rFonts w:cs="Arial"/>
+                <w:b/>
+                <w:color w:val="000000"/>
+                <w:sz w:val="28"/>
+                <w:szCs w:val="28"/>
+              </w:rPr>
+            </w:pPr>
+            <w:r>
+              <w:rPr>
+                <w:rFonts w:cs="Arial"/>
+                <w:b/>
+                <w:color w:val="000000"/>
+                <w:sz w:val="28"/>
+                <w:szCs w:val="28"/>
+                <w:lang w:val="it-IT"/>
+              </w:rPr>
+              <w:t xml:space="preserve">Panchaati No. - </w:t>
+            </w:r>
+            <w:r>
+              <w:rPr>
+                <w:rFonts w:cs="Arial"/>
+                <w:b/>
+                <w:color w:val="000000"/>
+                <w:sz w:val="28"/>
+                <w:szCs w:val="28"/>
+                <w:lang w:val="it-IT"/>
+              </w:rPr>
+              <w:t>56</w:t>
+            </w:r>
+          </w:p>
+        </w:tc>
+        <w:tc>
+          <w:tcPr>
+            <w:tcW w:w="4738" w:type="dxa"/>
+          </w:tcPr>
+          <w:p>
+            <w:pPr>
+              <w:widowControl w:val="0"/>
+              <w:autoSpaceDE w:val="0"/>
+              <w:autoSpaceDN w:val="0"/>
+              <w:adjustRightInd w:val="0"/>
+              <w:spacing w:before="0" w:line="240" w:lineRule="auto"/>
+              <w:rPr>
+                <w:rFonts w:ascii="BRH Devanagari Extra" w:hAnsi="BRH Devanagari Extra" w:cs="BRH Devanagari Extra"/>
+                <w:color w:val="000000"/>
+                <w:sz w:val="40"/>
+                <w:szCs w:val="40"/>
+              </w:rPr>
+            </w:pPr>
+            <w:r>
+              <w:rPr>
+                <w:rFonts w:ascii="BRH Devanagari Extra" w:hAnsi="BRH Devanagari Extra" w:cs="BRH Devanagari Extra"/>
+                <w:color w:val="000000"/>
+                <w:sz w:val="40"/>
+                <w:szCs w:val="40"/>
+              </w:rPr>
+              <w:t>L</w:t>
+            </w:r>
+            <w:r>
+              <w:rPr>
+                <w:rFonts w:ascii="BRH Malayalam Extra" w:hAnsi="BRH Malayalam Extra" w:cs="BRH Devanagari Extra"/>
+                <w:color w:val="000000"/>
+                <w:sz w:val="32"/>
+                <w:szCs w:val="40"/>
+              </w:rPr>
+              <w:t>–</w:t>
+            </w:r>
+            <w:proofErr w:type="spellStart"/>
+            <w:r>
+              <w:rPr>
+                <w:rFonts w:ascii="BRH Devanagari Extra" w:hAnsi="BRH Devanagari Extra" w:cs="BRH Devanagari Extra"/>
+                <w:color w:val="000000"/>
+                <w:sz w:val="40"/>
+                <w:szCs w:val="40"/>
+              </w:rPr>
+              <w:t>uÉÉ</w:t>
+            </w:r>
+            <w:r>
+              <w:rPr>
+                <w:rFonts w:ascii="BRH Devanagari Extra" w:hAnsi="BRH Devanagari Extra" w:cs="BRH Devanagari Extra"/>
+                <w:color w:val="000000"/>
+                <w:sz w:val="40"/>
+                <w:szCs w:val="40"/>
+                <w:highlight w:val="yellow"/>
+              </w:rPr>
+              <w:t>xqÉæÿ</w:t>
+            </w:r>
+            <w:proofErr w:type="spellEnd"/>
+            <w:r>
+              <w:rPr>
+                <w:rFonts w:ascii="BRH Devanagari Extra" w:hAnsi="BRH Devanagari Extra" w:cs="BRH Devanagari Extra"/>
+                <w:color w:val="000000"/>
+                <w:sz w:val="40"/>
+                <w:szCs w:val="40"/>
+              </w:rPr>
+              <w:t xml:space="preserve"> | A</w:t>
+            </w:r>
+            <w:r>
+              <w:rPr>
+                <w:rFonts w:ascii="BRH Malayalam Extra" w:hAnsi="BRH Malayalam Extra" w:cs="BRH Devanagari Extra"/>
+                <w:color w:val="000000"/>
+                <w:sz w:val="32"/>
+                <w:szCs w:val="40"/>
+                <w:highlight w:val="yellow"/>
+              </w:rPr>
+              <w:t>–</w:t>
+            </w:r>
+            <w:proofErr w:type="spellStart"/>
+            <w:r>
+              <w:rPr>
+                <w:rFonts w:ascii="BRH Devanagari Extra" w:hAnsi="BRH Devanagari Extra" w:cs="BRH Devanagari Extra"/>
+                <w:color w:val="000000"/>
+                <w:sz w:val="40"/>
+                <w:szCs w:val="40"/>
+                <w:highlight w:val="yellow"/>
+              </w:rPr>
+              <w:t>xqÉæ</w:t>
+            </w:r>
+            <w:proofErr w:type="spellEnd"/>
+            <w:r>
+              <w:rPr>
+                <w:rFonts w:ascii="BRH Malayalam Extra" w:hAnsi="BRH Malayalam Extra" w:cs="BRH Devanagari Extra"/>
+                <w:color w:val="000000"/>
+                <w:sz w:val="32"/>
+                <w:szCs w:val="40"/>
+                <w:highlight w:val="yellow"/>
+              </w:rPr>
+              <w:t>–</w:t>
+            </w:r>
+            <w:r>
+              <w:rPr>
+                <w:rFonts w:ascii="BRH Devanagari Extra" w:hAnsi="BRH Devanagari Extra" w:cs="BRH Devanagari Extra"/>
+                <w:color w:val="000000"/>
+                <w:sz w:val="40"/>
+                <w:szCs w:val="40"/>
+              </w:rPr>
+              <w:t xml:space="preserve"> mÉ</w:t>
+            </w:r>
+            <w:r>
+              <w:rPr>
+                <w:rFonts w:ascii="BRH Malayalam Extra" w:hAnsi="BRH Malayalam Extra" w:cs="BRH Devanagari Extra"/>
+                <w:color w:val="000000"/>
+                <w:sz w:val="32"/>
+                <w:szCs w:val="40"/>
+              </w:rPr>
+              <w:t>–</w:t>
+            </w:r>
+            <w:proofErr w:type="spellStart"/>
+            <w:r>
+              <w:rPr>
+                <w:rFonts w:ascii="BRH Devanagari Extra" w:hAnsi="BRH Devanagari Extra" w:cs="BRH Devanagari Extra"/>
+                <w:color w:val="000000"/>
+                <w:sz w:val="40"/>
+                <w:szCs w:val="40"/>
+              </w:rPr>
+              <w:t>SÉiÉç</w:t>
+            </w:r>
+            <w:proofErr w:type="spellEnd"/>
+            <w:r>
+              <w:rPr>
+                <w:rFonts w:ascii="BRH Devanagari Extra" w:hAnsi="BRH Devanagari Extra" w:cs="BRH Devanagari Extra"/>
+                <w:color w:val="000000"/>
+                <w:sz w:val="40"/>
+                <w:szCs w:val="40"/>
+              </w:rPr>
+              <w:t xml:space="preserve"> |</w:t>
+            </w:r>
+          </w:p>
+        </w:tc>
+        <w:tc>
+          <w:tcPr>
+            <w:tcW w:w="5220" w:type="dxa"/>
+          </w:tcPr>
+          <w:p>
+            <w:pPr>
+              <w:widowControl w:val="0"/>
+              <w:autoSpaceDE w:val="0"/>
+              <w:autoSpaceDN w:val="0"/>
+              <w:adjustRightInd w:val="0"/>
+              <w:spacing w:before="0" w:line="240" w:lineRule="auto"/>
+              <w:rPr>
+                <w:rFonts w:ascii="BRH Devanagari Extra" w:hAnsi="BRH Devanagari Extra" w:cs="BRH Devanagari Extra"/>
+                <w:color w:val="000000"/>
+                <w:sz w:val="40"/>
+                <w:szCs w:val="40"/>
+              </w:rPr>
+            </w:pPr>
+            <w:r>
+              <w:rPr>
+                <w:rFonts w:ascii="BRH Devanagari Extra" w:hAnsi="BRH Devanagari Extra" w:cs="BRH Devanagari Extra"/>
+                <w:color w:val="000000"/>
+                <w:sz w:val="40"/>
+                <w:szCs w:val="40"/>
+              </w:rPr>
+              <w:t>L</w:t>
+            </w:r>
+            <w:r>
+              <w:rPr>
+                <w:rFonts w:ascii="BRH Malayalam Extra" w:hAnsi="BRH Malayalam Extra" w:cs="BRH Devanagari Extra"/>
+                <w:color w:val="000000"/>
+                <w:sz w:val="32"/>
+                <w:szCs w:val="40"/>
+              </w:rPr>
+              <w:t>–</w:t>
+            </w:r>
+            <w:proofErr w:type="spellStart"/>
+            <w:r>
+              <w:rPr>
+                <w:rFonts w:ascii="BRH Devanagari Extra" w:hAnsi="BRH Devanagari Extra" w:cs="BRH Devanagari Extra"/>
+                <w:color w:val="000000"/>
+                <w:sz w:val="40"/>
+                <w:szCs w:val="40"/>
+              </w:rPr>
+              <w:t>uÉÉ</w:t>
+            </w:r>
+            <w:r>
+              <w:rPr>
+                <w:rFonts w:ascii="BRH Devanagari Extra" w:hAnsi="BRH Devanagari Extra" w:cs="BRH Devanagari Extra"/>
+                <w:color w:val="000000"/>
+                <w:sz w:val="40"/>
+                <w:szCs w:val="40"/>
+                <w:highlight w:val="green"/>
+              </w:rPr>
+              <w:t>xrÉæÿ</w:t>
+            </w:r>
+            <w:proofErr w:type="spellEnd"/>
+            <w:r>
+              <w:rPr>
+                <w:rFonts w:ascii="BRH Devanagari Extra" w:hAnsi="BRH Devanagari Extra" w:cs="BRH Devanagari Extra"/>
+                <w:color w:val="000000"/>
+                <w:sz w:val="40"/>
+                <w:szCs w:val="40"/>
+              </w:rPr>
+              <w:t xml:space="preserve"> | A</w:t>
+            </w:r>
+            <w:r>
+              <w:rPr>
+                <w:rFonts w:ascii="BRH Malayalam Extra" w:hAnsi="BRH Malayalam Extra" w:cs="BRH Devanagari Extra"/>
+                <w:color w:val="000000"/>
+                <w:sz w:val="32"/>
+                <w:szCs w:val="40"/>
+              </w:rPr>
+              <w:t>–</w:t>
+            </w:r>
+            <w:proofErr w:type="spellStart"/>
+            <w:r>
+              <w:rPr>
+                <w:rFonts w:ascii="BRH Devanagari Extra" w:hAnsi="BRH Devanagari Extra" w:cs="BRH Devanagari Extra"/>
+                <w:color w:val="000000"/>
+                <w:sz w:val="40"/>
+                <w:szCs w:val="40"/>
+                <w:highlight w:val="green"/>
+              </w:rPr>
+              <w:t>xrÉæ</w:t>
+            </w:r>
+            <w:proofErr w:type="spellEnd"/>
+            <w:r>
+              <w:rPr>
+                <w:rFonts w:ascii="BRH Malayalam Extra" w:hAnsi="BRH Malayalam Extra" w:cs="BRH Devanagari Extra"/>
+                <w:color w:val="000000"/>
+                <w:sz w:val="32"/>
+                <w:szCs w:val="40"/>
+                <w:highlight w:val="green"/>
+              </w:rPr>
+              <w:t>–</w:t>
+            </w:r>
+            <w:r>
+              <w:rPr>
+                <w:rFonts w:ascii="BRH Devanagari Extra" w:hAnsi="BRH Devanagari Extra" w:cs="BRH Devanagari Extra"/>
+                <w:color w:val="000000"/>
+                <w:sz w:val="40"/>
+                <w:szCs w:val="40"/>
+              </w:rPr>
+              <w:t xml:space="preserve"> mÉ</w:t>
+            </w:r>
+            <w:r>
+              <w:rPr>
+                <w:rFonts w:ascii="BRH Malayalam Extra" w:hAnsi="BRH Malayalam Extra" w:cs="BRH Devanagari Extra"/>
+                <w:color w:val="000000"/>
+                <w:sz w:val="32"/>
+                <w:szCs w:val="40"/>
+              </w:rPr>
+              <w:t>–</w:t>
+            </w:r>
+            <w:proofErr w:type="spellStart"/>
+            <w:r>
+              <w:rPr>
+                <w:rFonts w:ascii="BRH Devanagari Extra" w:hAnsi="BRH Devanagari Extra" w:cs="BRH Devanagari Extra"/>
+                <w:color w:val="000000"/>
+                <w:sz w:val="40"/>
+                <w:szCs w:val="40"/>
+              </w:rPr>
+              <w:t>SÉiÉç</w:t>
+            </w:r>
+            <w:proofErr w:type="spellEnd"/>
+            <w:r>
+              <w:rPr>
+                <w:rFonts w:ascii="BRH Devanagari Extra" w:hAnsi="BRH Devanagari Extra" w:cs="BRH Devanagari Extra"/>
+                <w:color w:val="000000"/>
+                <w:sz w:val="40"/>
+                <w:szCs w:val="40"/>
+              </w:rPr>
+              <w:t xml:space="preserve"> |</w:t>
             </w:r>
           </w:p>
         </w:tc>
@@ -1870,7 +2850,6 @@
                 <w:sz w:val="32"/>
                 <w:szCs w:val="32"/>
               </w:rPr>
-              <w:lastRenderedPageBreak/>
               <w:t>Reference</w:t>
             </w:r>
           </w:p>
@@ -1897,7 +2876,6 @@
                 <w:sz w:val="32"/>
                 <w:szCs w:val="32"/>
               </w:rPr>
-              <w:lastRenderedPageBreak/>
               <w:t>As Printed</w:t>
             </w:r>
           </w:p>
@@ -2506,6 +3484,7 @@
               </w:rPr>
               <w:t>–</w:t>
             </w:r>
+            <w:proofErr w:type="spellStart"/>
             <w:r>
               <w:rPr>
                 <w:rFonts w:ascii="BRH Devanagari Extra" w:hAnsi="BRH Devanagari Extra" w:cs="BRH Devanagari Extra"/>
@@ -2523,25 +3502,46 @@
                 <w:sz w:val="40"/>
                 <w:szCs w:val="40"/>
               </w:rPr>
-              <w:t>ÅÍpÉ | A</w:t>
-            </w:r>
-            <w:r>
-              <w:rPr>
-                <w:rFonts w:ascii="BRH Malayalam Extra" w:hAnsi="BRH Malayalam Extra" w:cs="BRH Devanagari Extra"/>
-                <w:color w:val="000000"/>
-                <w:sz w:val="32"/>
-                <w:szCs w:val="40"/>
-              </w:rPr>
-              <w:t>–</w:t>
-            </w:r>
-            <w:r>
-              <w:rPr>
-                <w:rFonts w:ascii="BRH Devanagari Extra" w:hAnsi="BRH Devanagari Extra" w:cs="BRH Devanagari Extra"/>
-                <w:color w:val="000000"/>
-                <w:sz w:val="40"/>
-                <w:szCs w:val="40"/>
-              </w:rPr>
-              <w:t>prÉþÍqÉërÉiÉ |</w:t>
+              <w:t>ÅÍpÉ</w:t>
+            </w:r>
+            <w:proofErr w:type="spellEnd"/>
+            <w:r>
+              <w:rPr>
+                <w:rFonts w:ascii="BRH Devanagari Extra" w:hAnsi="BRH Devanagari Extra" w:cs="BRH Devanagari Extra"/>
+                <w:color w:val="000000"/>
+                <w:sz w:val="40"/>
+                <w:szCs w:val="40"/>
+              </w:rPr>
+              <w:t xml:space="preserve"> | A</w:t>
+            </w:r>
+            <w:r>
+              <w:rPr>
+                <w:rFonts w:ascii="BRH Malayalam Extra" w:hAnsi="BRH Malayalam Extra" w:cs="BRH Devanagari Extra"/>
+                <w:color w:val="000000"/>
+                <w:sz w:val="32"/>
+                <w:szCs w:val="40"/>
+              </w:rPr>
+              <w:t>–</w:t>
+            </w:r>
+            <w:proofErr w:type="spellStart"/>
+            <w:r>
+              <w:rPr>
+                <w:rFonts w:ascii="BRH Devanagari Extra" w:hAnsi="BRH Devanagari Extra" w:cs="BRH Devanagari Extra"/>
+                <w:color w:val="000000"/>
+                <w:sz w:val="40"/>
+                <w:szCs w:val="40"/>
+              </w:rPr>
+              <w:t>prÉþÍqÉërÉiÉ</w:t>
+            </w:r>
+            <w:proofErr w:type="spellEnd"/>
+            <w:r>
+              <w:rPr>
+                <w:rFonts w:ascii="BRH Devanagari Extra" w:hAnsi="BRH Devanagari Extra" w:cs="BRH Devanagari Extra"/>
+                <w:color w:val="000000"/>
+                <w:sz w:val="40"/>
+                <w:szCs w:val="40"/>
+              </w:rPr>
+              <w:t xml:space="preserve"> |</w:t>
             </w:r>
           </w:p>
         </w:tc>
@@ -2582,6 +3582,7 @@
               </w:rPr>
               <w:t>–</w:t>
             </w:r>
+            <w:proofErr w:type="spellStart"/>
             <w:r>
               <w:rPr>
                 <w:rFonts w:ascii="BRH Devanagari Extra" w:hAnsi="BRH Devanagari Extra" w:cs="BRH Devanagari Extra"/>
@@ -2599,25 +3600,46 @@
                 <w:sz w:val="40"/>
                 <w:szCs w:val="40"/>
               </w:rPr>
-              <w:t>þåÅÍpÉ | A</w:t>
-            </w:r>
-            <w:r>
-              <w:rPr>
-                <w:rFonts w:ascii="BRH Malayalam Extra" w:hAnsi="BRH Malayalam Extra" w:cs="BRH Devanagari Extra"/>
-                <w:color w:val="000000"/>
-                <w:sz w:val="32"/>
-                <w:szCs w:val="40"/>
-              </w:rPr>
-              <w:t>–</w:t>
-            </w:r>
-            <w:r>
-              <w:rPr>
-                <w:rFonts w:ascii="BRH Devanagari Extra" w:hAnsi="BRH Devanagari Extra" w:cs="BRH Devanagari Extra"/>
-                <w:color w:val="000000"/>
-                <w:sz w:val="40"/>
-                <w:szCs w:val="40"/>
-              </w:rPr>
-              <w:t>prÉþÍqÉërÉiÉ |</w:t>
+              <w:t>þåÅÍpÉ</w:t>
+            </w:r>
+            <w:proofErr w:type="spellEnd"/>
+            <w:r>
+              <w:rPr>
+                <w:rFonts w:ascii="BRH Devanagari Extra" w:hAnsi="BRH Devanagari Extra" w:cs="BRH Devanagari Extra"/>
+                <w:color w:val="000000"/>
+                <w:sz w:val="40"/>
+                <w:szCs w:val="40"/>
+              </w:rPr>
+              <w:t xml:space="preserve"> | A</w:t>
+            </w:r>
+            <w:r>
+              <w:rPr>
+                <w:rFonts w:ascii="BRH Malayalam Extra" w:hAnsi="BRH Malayalam Extra" w:cs="BRH Devanagari Extra"/>
+                <w:color w:val="000000"/>
+                <w:sz w:val="32"/>
+                <w:szCs w:val="40"/>
+              </w:rPr>
+              <w:t>–</w:t>
+            </w:r>
+            <w:proofErr w:type="spellStart"/>
+            <w:r>
+              <w:rPr>
+                <w:rFonts w:ascii="BRH Devanagari Extra" w:hAnsi="BRH Devanagari Extra" w:cs="BRH Devanagari Extra"/>
+                <w:color w:val="000000"/>
+                <w:sz w:val="40"/>
+                <w:szCs w:val="40"/>
+              </w:rPr>
+              <w:t>prÉþÍqÉërÉiÉ</w:t>
+            </w:r>
+            <w:proofErr w:type="spellEnd"/>
+            <w:r>
+              <w:rPr>
+                <w:rFonts w:ascii="BRH Devanagari Extra" w:hAnsi="BRH Devanagari Extra" w:cs="BRH Devanagari Extra"/>
+                <w:color w:val="000000"/>
+                <w:sz w:val="40"/>
+                <w:szCs w:val="40"/>
+              </w:rPr>
+              <w:t xml:space="preserve"> |</w:t>
             </w:r>
           </w:p>
         </w:tc>
@@ -2764,24 +3786,36 @@
               </w:rPr>
               <w:t>–</w:t>
             </w:r>
-            <w:r>
-              <w:rPr>
-                <w:rFonts w:ascii="BRH Devanagari Extra" w:hAnsi="BRH Devanagari Extra" w:cs="BRH Devanagari Extra"/>
-                <w:color w:val="000000"/>
-                <w:sz w:val="40"/>
-                <w:szCs w:val="40"/>
-              </w:rPr>
-              <w:t>uÉælÉÿqÉç | L</w:t>
-            </w:r>
-            <w:r>
-              <w:rPr>
-                <w:rFonts w:ascii="BRH Malayalam Extra" w:hAnsi="BRH Malayalam Extra" w:cs="BRH Devanagari Extra"/>
-                <w:color w:val="000000"/>
-                <w:sz w:val="32"/>
-                <w:szCs w:val="40"/>
-              </w:rPr>
-              <w:t>–</w:t>
-            </w:r>
+            <w:proofErr w:type="spellStart"/>
+            <w:r>
+              <w:rPr>
+                <w:rFonts w:ascii="BRH Devanagari Extra" w:hAnsi="BRH Devanagari Extra" w:cs="BRH Devanagari Extra"/>
+                <w:color w:val="000000"/>
+                <w:sz w:val="40"/>
+                <w:szCs w:val="40"/>
+              </w:rPr>
+              <w:t>uÉælÉÿqÉç</w:t>
+            </w:r>
+            <w:proofErr w:type="spellEnd"/>
+            <w:r>
+              <w:rPr>
+                <w:rFonts w:ascii="BRH Devanagari Extra" w:hAnsi="BRH Devanagari Extra" w:cs="BRH Devanagari Extra"/>
+                <w:color w:val="000000"/>
+                <w:sz w:val="40"/>
+                <w:szCs w:val="40"/>
+              </w:rPr>
+              <w:t xml:space="preserve"> | L</w:t>
+            </w:r>
+            <w:r>
+              <w:rPr>
+                <w:rFonts w:ascii="BRH Malayalam Extra" w:hAnsi="BRH Malayalam Extra" w:cs="BRH Devanagari Extra"/>
+                <w:color w:val="000000"/>
+                <w:sz w:val="32"/>
+                <w:szCs w:val="40"/>
+              </w:rPr>
+              <w:t>–</w:t>
+            </w:r>
+            <w:proofErr w:type="spellStart"/>
             <w:r>
               <w:rPr>
                 <w:rFonts w:ascii="BRH Devanagari Extra" w:hAnsi="BRH Devanagari Extra" w:cs="BRH Devanagari Extra"/>
@@ -2792,6 +3826,7 @@
               </w:rPr>
               <w:t>lÉÉ</w:t>
             </w:r>
+            <w:proofErr w:type="spellEnd"/>
             <w:r>
               <w:rPr>
                 <w:rFonts w:ascii="BRH Malayalam Extra" w:hAnsi="BRH Malayalam Extra" w:cs="BRH Devanagari Extra"/>
@@ -2826,7 +3861,27 @@
                 <w:sz w:val="40"/>
                 <w:szCs w:val="40"/>
               </w:rPr>
-              <w:t xml:space="preserve"> xÉuÉïþrÉÉ |</w:t>
+              <w:t xml:space="preserve"> </w:t>
+            </w:r>
+            <w:proofErr w:type="spellStart"/>
+            <w:r>
+              <w:rPr>
+                <w:rFonts w:ascii="BRH Devanagari Extra" w:hAnsi="BRH Devanagari Extra" w:cs="BRH Devanagari Extra"/>
+                <w:color w:val="000000"/>
+                <w:sz w:val="40"/>
+                <w:szCs w:val="40"/>
+              </w:rPr>
+              <w:t>xÉuÉïþrÉÉ</w:t>
+            </w:r>
+            <w:proofErr w:type="spellEnd"/>
+            <w:r>
+              <w:rPr>
+                <w:rFonts w:ascii="BRH Devanagari Extra" w:hAnsi="BRH Devanagari Extra" w:cs="BRH Devanagari Extra"/>
+                <w:color w:val="000000"/>
+                <w:sz w:val="40"/>
+                <w:szCs w:val="40"/>
+              </w:rPr>
+              <w:t xml:space="preserve"> |</w:t>
             </w:r>
           </w:p>
         </w:tc>
@@ -2862,14 +3917,25 @@
               </w:rPr>
               <w:t>–</w:t>
             </w:r>
-            <w:r>
-              <w:rPr>
-                <w:rFonts w:ascii="BRH Devanagari Extra" w:hAnsi="BRH Devanagari Extra" w:cs="BRH Devanagari Extra"/>
-                <w:color w:val="000000"/>
-                <w:sz w:val="40"/>
-                <w:szCs w:val="40"/>
-              </w:rPr>
-              <w:t>uÉælÉÿqÉç | L</w:t>
+            <w:proofErr w:type="spellStart"/>
+            <w:r>
+              <w:rPr>
+                <w:rFonts w:ascii="BRH Devanagari Extra" w:hAnsi="BRH Devanagari Extra" w:cs="BRH Devanagari Extra"/>
+                <w:color w:val="000000"/>
+                <w:sz w:val="40"/>
+                <w:szCs w:val="40"/>
+              </w:rPr>
+              <w:t>uÉælÉÿqÉç</w:t>
+            </w:r>
+            <w:proofErr w:type="spellEnd"/>
+            <w:r>
+              <w:rPr>
+                <w:rFonts w:ascii="BRH Devanagari Extra" w:hAnsi="BRH Devanagari Extra" w:cs="BRH Devanagari Extra"/>
+                <w:color w:val="000000"/>
+                <w:sz w:val="40"/>
+                <w:szCs w:val="40"/>
+              </w:rPr>
+              <w:t xml:space="preserve"> | L</w:t>
             </w:r>
             <w:r>
               <w:rPr>
@@ -2926,7 +3992,27 @@
                 <w:sz w:val="40"/>
                 <w:szCs w:val="40"/>
               </w:rPr>
-              <w:t xml:space="preserve"> xÉuÉïþrÉÉ |</w:t>
+              <w:t xml:space="preserve"> </w:t>
+            </w:r>
+            <w:proofErr w:type="spellStart"/>
+            <w:r>
+              <w:rPr>
+                <w:rFonts w:ascii="BRH Devanagari Extra" w:hAnsi="BRH Devanagari Extra" w:cs="BRH Devanagari Extra"/>
+                <w:color w:val="000000"/>
+                <w:sz w:val="40"/>
+                <w:szCs w:val="40"/>
+              </w:rPr>
+              <w:t>xÉuÉïþrÉÉ</w:t>
+            </w:r>
+            <w:proofErr w:type="spellEnd"/>
+            <w:r>
+              <w:rPr>
+                <w:rFonts w:ascii="BRH Devanagari Extra" w:hAnsi="BRH Devanagari Extra" w:cs="BRH Devanagari Extra"/>
+                <w:color w:val="000000"/>
+                <w:sz w:val="40"/>
+                <w:szCs w:val="40"/>
+              </w:rPr>
+              <w:t xml:space="preserve"> |</w:t>
             </w:r>
           </w:p>
         </w:tc>
@@ -3056,6 +4142,7 @@
                 <w:szCs w:val="40"/>
               </w:rPr>
             </w:pPr>
+            <w:proofErr w:type="spellStart"/>
             <w:r>
               <w:rPr>
                 <w:rFonts w:ascii="BRH Devanagari Extra" w:hAnsi="BRH Devanagari Extra" w:cs="BRH Devanagari Extra"/>
@@ -3075,6 +4162,7 @@
               </w:rPr>
               <w:t>uÉ</w:t>
             </w:r>
+            <w:proofErr w:type="spellEnd"/>
             <w:r>
               <w:rPr>
                 <w:rFonts w:ascii="BRH Malayalam Extra" w:hAnsi="BRH Malayalam Extra" w:cs="BRH Devanagari Extra"/>
@@ -3102,6 +4190,7 @@
               </w:rPr>
               <w:t>–</w:t>
             </w:r>
+            <w:proofErr w:type="spellStart"/>
             <w:r>
               <w:rPr>
                 <w:rFonts w:ascii="BRH Devanagari Extra" w:hAnsi="BRH Devanagari Extra" w:cs="BRH Devanagari Extra"/>
@@ -3111,6 +4200,7 @@
               </w:rPr>
               <w:t>ÌiÉ</w:t>
             </w:r>
+            <w:proofErr w:type="spellEnd"/>
             <w:r>
               <w:rPr>
                 <w:rFonts w:ascii="BRH Malayalam Extra" w:hAnsi="BRH Malayalam Extra" w:cs="BRH Devanagari Extra"/>
@@ -3138,14 +4228,25 @@
               </w:rPr>
               <w:t>–</w:t>
             </w:r>
-            <w:r>
-              <w:rPr>
-                <w:rFonts w:ascii="BRH Devanagari Extra" w:hAnsi="BRH Devanagari Extra" w:cs="BRH Devanagari Extra"/>
-                <w:color w:val="000000"/>
-                <w:sz w:val="40"/>
-                <w:szCs w:val="40"/>
-              </w:rPr>
-              <w:t>imÉÌiÉþÈ |</w:t>
+            <w:proofErr w:type="spellStart"/>
+            <w:r>
+              <w:rPr>
+                <w:rFonts w:ascii="BRH Devanagari Extra" w:hAnsi="BRH Devanagari Extra" w:cs="BRH Devanagari Extra"/>
+                <w:color w:val="000000"/>
+                <w:sz w:val="40"/>
+                <w:szCs w:val="40"/>
+              </w:rPr>
+              <w:t>imÉÌiÉþÈ</w:t>
+            </w:r>
+            <w:proofErr w:type="spellEnd"/>
+            <w:r>
+              <w:rPr>
+                <w:rFonts w:ascii="BRH Devanagari Extra" w:hAnsi="BRH Devanagari Extra" w:cs="BRH Devanagari Extra"/>
+                <w:color w:val="000000"/>
+                <w:sz w:val="40"/>
+                <w:szCs w:val="40"/>
+              </w:rPr>
+              <w:t xml:space="preserve"> |</w:t>
             </w:r>
           </w:p>
         </w:tc>
@@ -3223,6 +4324,7 @@
               </w:rPr>
               <w:t>–</w:t>
             </w:r>
+            <w:proofErr w:type="spellStart"/>
             <w:r>
               <w:rPr>
                 <w:rFonts w:ascii="BRH Devanagari Extra" w:hAnsi="BRH Devanagari Extra" w:cs="BRH Devanagari Extra"/>
@@ -3232,6 +4334,7 @@
               </w:rPr>
               <w:t>ÌiÉ</w:t>
             </w:r>
+            <w:proofErr w:type="spellEnd"/>
             <w:r>
               <w:rPr>
                 <w:rFonts w:ascii="BRH Malayalam Extra" w:hAnsi="BRH Malayalam Extra" w:cs="BRH Devanagari Extra"/>
@@ -3259,14 +4362,25 @@
               </w:rPr>
               <w:t>–</w:t>
             </w:r>
-            <w:r>
-              <w:rPr>
-                <w:rFonts w:ascii="BRH Devanagari Extra" w:hAnsi="BRH Devanagari Extra" w:cs="BRH Devanagari Extra"/>
-                <w:color w:val="000000"/>
-                <w:sz w:val="40"/>
-                <w:szCs w:val="40"/>
-              </w:rPr>
-              <w:t>imÉÌiÉþÈ |</w:t>
+            <w:proofErr w:type="spellStart"/>
+            <w:r>
+              <w:rPr>
+                <w:rFonts w:ascii="BRH Devanagari Extra" w:hAnsi="BRH Devanagari Extra" w:cs="BRH Devanagari Extra"/>
+                <w:color w:val="000000"/>
+                <w:sz w:val="40"/>
+                <w:szCs w:val="40"/>
+              </w:rPr>
+              <w:t>imÉÌiÉþÈ</w:t>
+            </w:r>
+            <w:proofErr w:type="spellEnd"/>
+            <w:r>
+              <w:rPr>
+                <w:rFonts w:ascii="BRH Devanagari Extra" w:hAnsi="BRH Devanagari Extra" w:cs="BRH Devanagari Extra"/>
+                <w:color w:val="000000"/>
+                <w:sz w:val="40"/>
+                <w:szCs w:val="40"/>
+              </w:rPr>
+              <w:t xml:space="preserve"> |</w:t>
             </w:r>
           </w:p>
         </w:tc>
@@ -3304,6 +4418,7 @@
                 <w:sz w:val="28"/>
                 <w:szCs w:val="32"/>
               </w:rPr>
+              <w:lastRenderedPageBreak/>
               <w:t>T.S.6.1.2.2 – Kramam</w:t>
             </w:r>
           </w:p>
@@ -3397,15 +4512,37 @@
                 <w:szCs w:val="40"/>
               </w:rPr>
             </w:pPr>
-            <w:r>
-              <w:rPr>
-                <w:rFonts w:ascii="BRH Devanagari Extra" w:hAnsi="BRH Devanagari Extra" w:cs="BRH Devanagari Extra"/>
-                <w:color w:val="000000"/>
-                <w:sz w:val="40"/>
-                <w:szCs w:val="40"/>
-              </w:rPr>
-              <w:t>CÌiÉþ qÉå</w:t>
-            </w:r>
+            <w:proofErr w:type="spellStart"/>
+            <w:r>
+              <w:rPr>
+                <w:rFonts w:ascii="BRH Devanagari Extra" w:hAnsi="BRH Devanagari Extra" w:cs="BRH Devanagari Extra"/>
+                <w:color w:val="000000"/>
+                <w:sz w:val="40"/>
+                <w:szCs w:val="40"/>
+              </w:rPr>
+              <w:t>CÌiÉþ</w:t>
+            </w:r>
+            <w:proofErr w:type="spellEnd"/>
+            <w:r>
+              <w:rPr>
+                <w:rFonts w:ascii="BRH Devanagari Extra" w:hAnsi="BRH Devanagari Extra" w:cs="BRH Devanagari Extra"/>
+                <w:color w:val="000000"/>
+                <w:sz w:val="40"/>
+                <w:szCs w:val="40"/>
+              </w:rPr>
+              <w:t xml:space="preserve"> </w:t>
+            </w:r>
+            <w:proofErr w:type="spellStart"/>
+            <w:r>
+              <w:rPr>
+                <w:rFonts w:ascii="BRH Devanagari Extra" w:hAnsi="BRH Devanagari Extra" w:cs="BRH Devanagari Extra"/>
+                <w:color w:val="000000"/>
+                <w:sz w:val="40"/>
+                <w:szCs w:val="40"/>
+              </w:rPr>
+              <w:t>qÉå</w:t>
+            </w:r>
+            <w:proofErr w:type="spellEnd"/>
             <w:r>
               <w:rPr>
                 <w:rFonts w:ascii="BRH Malayalam Extra" w:hAnsi="BRH Malayalam Extra" w:cs="BRH Devanagari Extra"/>
@@ -3424,36 +4561,79 @@
                 <w:szCs w:val="40"/>
                 <w:highlight w:val="yellow"/>
               </w:rPr>
-              <w:t>®É</w:t>
-            </w:r>
-            <w:r>
-              <w:rPr>
-                <w:rFonts w:ascii="BRH Devanagari Extra" w:hAnsi="BRH Devanagari Extra" w:cs="BRH Devanagari Extra"/>
-                <w:color w:val="000000"/>
-                <w:sz w:val="40"/>
-                <w:szCs w:val="40"/>
-              </w:rPr>
-              <w:t>rÉæÿ | qÉå</w:t>
-            </w:r>
-            <w:r>
-              <w:rPr>
-                <w:rFonts w:ascii="BRH Malayalam Extra" w:hAnsi="BRH Malayalam Extra" w:cs="BRH Devanagari Extra"/>
-                <w:color w:val="000000"/>
-                <w:sz w:val="32"/>
+              <w:t>®</w:t>
+            </w:r>
+            <w:proofErr w:type="spellStart"/>
+            <w:r>
+              <w:rPr>
+                <w:rFonts w:ascii="BRH Devanagari Extra" w:hAnsi="BRH Devanagari Extra" w:cs="BRH Devanagari Extra"/>
+                <w:color w:val="000000"/>
+                <w:sz w:val="40"/>
                 <w:szCs w:val="40"/>
                 <w:highlight w:val="yellow"/>
               </w:rPr>
-              <w:t>–</w:t>
-            </w:r>
-            <w:r>
-              <w:rPr>
-                <w:rFonts w:ascii="BRH Devanagari Extra" w:hAnsi="BRH Devanagari Extra" w:cs="BRH Devanagari Extra"/>
-                <w:color w:val="000000"/>
-                <w:sz w:val="40"/>
+              <w:t>É</w:t>
+            </w:r>
+            <w:r>
+              <w:rPr>
+                <w:rFonts w:ascii="BRH Devanagari Extra" w:hAnsi="BRH Devanagari Extra" w:cs="BRH Devanagari Extra"/>
+                <w:color w:val="000000"/>
+                <w:sz w:val="40"/>
+                <w:szCs w:val="40"/>
+              </w:rPr>
+              <w:t>rÉæÿ</w:t>
+            </w:r>
+            <w:proofErr w:type="spellEnd"/>
+            <w:r>
+              <w:rPr>
+                <w:rFonts w:ascii="BRH Devanagari Extra" w:hAnsi="BRH Devanagari Extra" w:cs="BRH Devanagari Extra"/>
+                <w:color w:val="000000"/>
+                <w:sz w:val="40"/>
+                <w:szCs w:val="40"/>
+              </w:rPr>
+              <w:t xml:space="preserve"> | </w:t>
+            </w:r>
+            <w:proofErr w:type="spellStart"/>
+            <w:r>
+              <w:rPr>
+                <w:rFonts w:ascii="BRH Devanagari Extra" w:hAnsi="BRH Devanagari Extra" w:cs="BRH Devanagari Extra"/>
+                <w:color w:val="000000"/>
+                <w:sz w:val="40"/>
+                <w:szCs w:val="40"/>
+              </w:rPr>
+              <w:t>qÉå</w:t>
+            </w:r>
+            <w:proofErr w:type="spellEnd"/>
+            <w:r>
+              <w:rPr>
+                <w:rFonts w:ascii="BRH Malayalam Extra" w:hAnsi="BRH Malayalam Extra" w:cs="BRH Devanagari Extra"/>
+                <w:color w:val="000000"/>
+                <w:sz w:val="32"/>
                 <w:szCs w:val="40"/>
                 <w:highlight w:val="yellow"/>
               </w:rPr>
-              <w:t>®É</w:t>
+              <w:t>–</w:t>
+            </w:r>
+            <w:r>
+              <w:rPr>
+                <w:rFonts w:ascii="BRH Devanagari Extra" w:hAnsi="BRH Devanagari Extra" w:cs="BRH Devanagari Extra"/>
+                <w:color w:val="000000"/>
+                <w:sz w:val="40"/>
+                <w:szCs w:val="40"/>
+                <w:highlight w:val="yellow"/>
+              </w:rPr>
+              <w:t>®</w:t>
+            </w:r>
+            <w:proofErr w:type="spellStart"/>
+            <w:r>
+              <w:rPr>
+                <w:rFonts w:ascii="BRH Devanagari Extra" w:hAnsi="BRH Devanagari Extra" w:cs="BRH Devanagari Extra"/>
+                <w:color w:val="000000"/>
+                <w:sz w:val="40"/>
+                <w:szCs w:val="40"/>
+                <w:highlight w:val="yellow"/>
+              </w:rPr>
+              <w:t>É</w:t>
             </w:r>
             <w:r>
               <w:rPr>
@@ -3464,23 +4644,44 @@
               </w:rPr>
               <w:t>rÉæ</w:t>
             </w:r>
-            <w:r>
-              <w:rPr>
-                <w:rFonts w:ascii="BRH Malayalam Extra" w:hAnsi="BRH Malayalam Extra" w:cs="BRH Devanagari Extra"/>
-                <w:color w:val="000000"/>
-                <w:sz w:val="32"/>
-                <w:szCs w:val="40"/>
-              </w:rPr>
-              <w:t>–</w:t>
-            </w:r>
-            <w:r>
-              <w:rPr>
-                <w:rFonts w:ascii="BRH Devanagari Extra" w:hAnsi="BRH Devanagari Extra" w:cs="BRH Devanagari Extra"/>
-                <w:color w:val="000000"/>
-                <w:sz w:val="40"/>
-                <w:szCs w:val="40"/>
-              </w:rPr>
-              <w:t xml:space="preserve"> qÉlÉþxÉå |</w:t>
+            <w:proofErr w:type="spellEnd"/>
+            <w:r>
+              <w:rPr>
+                <w:rFonts w:ascii="BRH Malayalam Extra" w:hAnsi="BRH Malayalam Extra" w:cs="BRH Devanagari Extra"/>
+                <w:color w:val="000000"/>
+                <w:sz w:val="32"/>
+                <w:szCs w:val="40"/>
+              </w:rPr>
+              <w:t>–</w:t>
+            </w:r>
+            <w:r>
+              <w:rPr>
+                <w:rFonts w:ascii="BRH Devanagari Extra" w:hAnsi="BRH Devanagari Extra" w:cs="BRH Devanagari Extra"/>
+                <w:color w:val="000000"/>
+                <w:sz w:val="40"/>
+                <w:szCs w:val="40"/>
+              </w:rPr>
+              <w:t xml:space="preserve"> </w:t>
+            </w:r>
+            <w:proofErr w:type="spellStart"/>
+            <w:r>
+              <w:rPr>
+                <w:rFonts w:ascii="BRH Devanagari Extra" w:hAnsi="BRH Devanagari Extra" w:cs="BRH Devanagari Extra"/>
+                <w:color w:val="000000"/>
+                <w:sz w:val="40"/>
+                <w:szCs w:val="40"/>
+              </w:rPr>
+              <w:t>qÉlÉþxÉå</w:t>
+            </w:r>
+            <w:proofErr w:type="spellEnd"/>
+            <w:r>
+              <w:rPr>
+                <w:rFonts w:ascii="BRH Devanagari Extra" w:hAnsi="BRH Devanagari Extra" w:cs="BRH Devanagari Extra"/>
+                <w:color w:val="000000"/>
+                <w:sz w:val="40"/>
+                <w:szCs w:val="40"/>
+              </w:rPr>
+              <w:t xml:space="preserve"> |</w:t>
             </w:r>
           </w:p>
         </w:tc>
@@ -3502,24 +4703,47 @@
                 <w:szCs w:val="40"/>
               </w:rPr>
             </w:pPr>
-            <w:r>
-              <w:rPr>
-                <w:rFonts w:ascii="BRH Devanagari Extra" w:hAnsi="BRH Devanagari Extra" w:cs="BRH Devanagari Extra"/>
-                <w:color w:val="000000"/>
-                <w:sz w:val="40"/>
-                <w:szCs w:val="40"/>
-              </w:rPr>
-              <w:t>CÌiÉþ qÉå</w:t>
-            </w:r>
-            <w:r>
-              <w:rPr>
-                <w:rFonts w:ascii="BRH Malayalam Extra" w:hAnsi="BRH Malayalam Extra" w:cs="BRH Devanagari Extra"/>
-                <w:color w:val="000000"/>
-                <w:sz w:val="32"/>
-                <w:szCs w:val="40"/>
-              </w:rPr>
-              <w:t>–</w:t>
-            </w:r>
+            <w:proofErr w:type="spellStart"/>
+            <w:r>
+              <w:rPr>
+                <w:rFonts w:ascii="BRH Devanagari Extra" w:hAnsi="BRH Devanagari Extra" w:cs="BRH Devanagari Extra"/>
+                <w:color w:val="000000"/>
+                <w:sz w:val="40"/>
+                <w:szCs w:val="40"/>
+              </w:rPr>
+              <w:t>CÌiÉþ</w:t>
+            </w:r>
+            <w:proofErr w:type="spellEnd"/>
+            <w:r>
+              <w:rPr>
+                <w:rFonts w:ascii="BRH Devanagari Extra" w:hAnsi="BRH Devanagari Extra" w:cs="BRH Devanagari Extra"/>
+                <w:color w:val="000000"/>
+                <w:sz w:val="40"/>
+                <w:szCs w:val="40"/>
+              </w:rPr>
+              <w:t xml:space="preserve"> </w:t>
+            </w:r>
+            <w:proofErr w:type="spellStart"/>
+            <w:r>
+              <w:rPr>
+                <w:rFonts w:ascii="BRH Devanagari Extra" w:hAnsi="BRH Devanagari Extra" w:cs="BRH Devanagari Extra"/>
+                <w:color w:val="000000"/>
+                <w:sz w:val="40"/>
+                <w:szCs w:val="40"/>
+              </w:rPr>
+              <w:t>qÉå</w:t>
+            </w:r>
+            <w:proofErr w:type="spellEnd"/>
+            <w:r>
+              <w:rPr>
+                <w:rFonts w:ascii="BRH Malayalam Extra" w:hAnsi="BRH Malayalam Extra" w:cs="BRH Devanagari Extra"/>
+                <w:color w:val="000000"/>
+                <w:sz w:val="32"/>
+                <w:szCs w:val="40"/>
+              </w:rPr>
+              <w:t>–</w:t>
+            </w:r>
+            <w:proofErr w:type="spellStart"/>
             <w:r>
               <w:rPr>
                 <w:rFonts w:ascii="BRH Devanagari Extra" w:hAnsi="BRH Devanagari Extra" w:cs="BRH Devanagari Extra"/>
@@ -3546,17 +4770,39 @@
                 <w:sz w:val="40"/>
                 <w:szCs w:val="40"/>
               </w:rPr>
-              <w:t>rÉæÿ | qÉå</w:t>
-            </w:r>
-            <w:r>
-              <w:rPr>
-                <w:rFonts w:ascii="BRH Malayalam Extra" w:hAnsi="BRH Malayalam Extra" w:cs="BRH Devanagari Extra"/>
-                <w:color w:val="000000"/>
-                <w:sz w:val="32"/>
-                <w:szCs w:val="40"/>
-              </w:rPr>
-              <w:t>–</w:t>
-            </w:r>
+              <w:t>rÉæÿ</w:t>
+            </w:r>
+            <w:proofErr w:type="spellEnd"/>
+            <w:r>
+              <w:rPr>
+                <w:rFonts w:ascii="BRH Devanagari Extra" w:hAnsi="BRH Devanagari Extra" w:cs="BRH Devanagari Extra"/>
+                <w:color w:val="000000"/>
+                <w:sz w:val="40"/>
+                <w:szCs w:val="40"/>
+              </w:rPr>
+              <w:t xml:space="preserve"> | </w:t>
+            </w:r>
+            <w:proofErr w:type="spellStart"/>
+            <w:r>
+              <w:rPr>
+                <w:rFonts w:ascii="BRH Devanagari Extra" w:hAnsi="BRH Devanagari Extra" w:cs="BRH Devanagari Extra"/>
+                <w:color w:val="000000"/>
+                <w:sz w:val="40"/>
+                <w:szCs w:val="40"/>
+              </w:rPr>
+              <w:t>qÉå</w:t>
+            </w:r>
+            <w:proofErr w:type="spellEnd"/>
+            <w:r>
+              <w:rPr>
+                <w:rFonts w:ascii="BRH Malayalam Extra" w:hAnsi="BRH Malayalam Extra" w:cs="BRH Devanagari Extra"/>
+                <w:color w:val="000000"/>
+                <w:sz w:val="32"/>
+                <w:szCs w:val="40"/>
+              </w:rPr>
+              <w:t>–</w:t>
+            </w:r>
+            <w:proofErr w:type="spellStart"/>
             <w:r>
               <w:rPr>
                 <w:rFonts w:ascii="BRH Devanagari Extra" w:hAnsi="BRH Devanagari Extra" w:cs="BRH Devanagari Extra"/>
@@ -3585,23 +4831,44 @@
               </w:rPr>
               <w:t>rÉæ</w:t>
             </w:r>
-            <w:r>
-              <w:rPr>
-                <w:rFonts w:ascii="BRH Malayalam Extra" w:hAnsi="BRH Malayalam Extra" w:cs="BRH Devanagari Extra"/>
-                <w:color w:val="000000"/>
-                <w:sz w:val="32"/>
-                <w:szCs w:val="40"/>
-              </w:rPr>
-              <w:t>–</w:t>
-            </w:r>
-            <w:r>
-              <w:rPr>
-                <w:rFonts w:ascii="BRH Devanagari Extra" w:hAnsi="BRH Devanagari Extra" w:cs="BRH Devanagari Extra"/>
-                <w:color w:val="000000"/>
-                <w:sz w:val="40"/>
-                <w:szCs w:val="40"/>
-              </w:rPr>
-              <w:t xml:space="preserve"> qÉlÉþxÉå |</w:t>
+            <w:proofErr w:type="spellEnd"/>
+            <w:r>
+              <w:rPr>
+                <w:rFonts w:ascii="BRH Malayalam Extra" w:hAnsi="BRH Malayalam Extra" w:cs="BRH Devanagari Extra"/>
+                <w:color w:val="000000"/>
+                <w:sz w:val="32"/>
+                <w:szCs w:val="40"/>
+              </w:rPr>
+              <w:t>–</w:t>
+            </w:r>
+            <w:r>
+              <w:rPr>
+                <w:rFonts w:ascii="BRH Devanagari Extra" w:hAnsi="BRH Devanagari Extra" w:cs="BRH Devanagari Extra"/>
+                <w:color w:val="000000"/>
+                <w:sz w:val="40"/>
+                <w:szCs w:val="40"/>
+              </w:rPr>
+              <w:t xml:space="preserve"> </w:t>
+            </w:r>
+            <w:proofErr w:type="spellStart"/>
+            <w:r>
+              <w:rPr>
+                <w:rFonts w:ascii="BRH Devanagari Extra" w:hAnsi="BRH Devanagari Extra" w:cs="BRH Devanagari Extra"/>
+                <w:color w:val="000000"/>
+                <w:sz w:val="40"/>
+                <w:szCs w:val="40"/>
+              </w:rPr>
+              <w:t>qÉlÉþxÉå</w:t>
+            </w:r>
+            <w:proofErr w:type="spellEnd"/>
+            <w:r>
+              <w:rPr>
+                <w:rFonts w:ascii="BRH Devanagari Extra" w:hAnsi="BRH Devanagari Extra" w:cs="BRH Devanagari Extra"/>
+                <w:color w:val="000000"/>
+                <w:sz w:val="40"/>
+                <w:szCs w:val="40"/>
+              </w:rPr>
+              <w:t xml:space="preserve"> |</w:t>
             </w:r>
           </w:p>
         </w:tc>
@@ -3639,7 +4906,6 @@
                 <w:sz w:val="28"/>
                 <w:szCs w:val="32"/>
               </w:rPr>
-              <w:lastRenderedPageBreak/>
               <w:t>T.S.6.1.2.2 – Kramam</w:t>
             </w:r>
           </w:p>
@@ -3776,8 +5042,19 @@
                 <w:sz w:val="40"/>
                 <w:szCs w:val="40"/>
               </w:rPr>
-              <w:t xml:space="preserve"> qÉå</w:t>
-            </w:r>
+              <w:t xml:space="preserve"> </w:t>
+            </w:r>
+            <w:proofErr w:type="spellStart"/>
+            <w:r>
+              <w:rPr>
+                <w:rFonts w:ascii="BRH Devanagari Extra" w:hAnsi="BRH Devanagari Extra" w:cs="BRH Devanagari Extra"/>
+                <w:color w:val="000000"/>
+                <w:sz w:val="40"/>
+                <w:szCs w:val="40"/>
+              </w:rPr>
+              <w:t>qÉå</w:t>
+            </w:r>
+            <w:proofErr w:type="spellEnd"/>
             <w:r>
               <w:rPr>
                 <w:rFonts w:ascii="BRH Malayalam Extra" w:hAnsi="BRH Malayalam Extra" w:cs="BRH Devanagari Extra"/>
@@ -3797,15 +5074,37 @@
               </w:rPr>
               <w:t>®</w:t>
             </w:r>
-            <w:r>
-              <w:rPr>
-                <w:rFonts w:ascii="BRH Devanagari Extra" w:hAnsi="BRH Devanagari Extra" w:cs="BRH Devanagari Extra"/>
-                <w:color w:val="000000"/>
-                <w:sz w:val="40"/>
-                <w:szCs w:val="40"/>
-              </w:rPr>
-              <w:t>rÉÉÿ | qÉå</w:t>
-            </w:r>
+            <w:proofErr w:type="spellStart"/>
+            <w:r>
+              <w:rPr>
+                <w:rFonts w:ascii="BRH Devanagari Extra" w:hAnsi="BRH Devanagari Extra" w:cs="BRH Devanagari Extra"/>
+                <w:color w:val="000000"/>
+                <w:sz w:val="40"/>
+                <w:szCs w:val="40"/>
+              </w:rPr>
+              <w:t>rÉÉÿ</w:t>
+            </w:r>
+            <w:proofErr w:type="spellEnd"/>
+            <w:r>
+              <w:rPr>
+                <w:rFonts w:ascii="BRH Devanagari Extra" w:hAnsi="BRH Devanagari Extra" w:cs="BRH Devanagari Extra"/>
+                <w:color w:val="000000"/>
+                <w:sz w:val="40"/>
+                <w:szCs w:val="40"/>
+              </w:rPr>
+              <w:t xml:space="preserve"> | </w:t>
+            </w:r>
+            <w:proofErr w:type="spellStart"/>
+            <w:r>
+              <w:rPr>
+                <w:rFonts w:ascii="BRH Devanagari Extra" w:hAnsi="BRH Devanagari Extra" w:cs="BRH Devanagari Extra"/>
+                <w:color w:val="000000"/>
+                <w:sz w:val="40"/>
+                <w:szCs w:val="40"/>
+              </w:rPr>
+              <w:t>qÉå</w:t>
+            </w:r>
+            <w:proofErr w:type="spellEnd"/>
             <w:r>
               <w:rPr>
                 <w:rFonts w:ascii="BRH Malayalam Extra" w:hAnsi="BRH Malayalam Extra" w:cs="BRH Devanagari Extra"/>
@@ -3825,6 +5124,7 @@
               </w:rPr>
               <w:t>®</w:t>
             </w:r>
+            <w:proofErr w:type="spellStart"/>
             <w:r>
               <w:rPr>
                 <w:rFonts w:ascii="BRH Devanagari Extra" w:hAnsi="BRH Devanagari Extra" w:cs="BRH Devanagari Extra"/>
@@ -3834,23 +5134,44 @@
               </w:rPr>
               <w:t>rÉÉ</w:t>
             </w:r>
-            <w:r>
-              <w:rPr>
-                <w:rFonts w:ascii="BRH Malayalam Extra" w:hAnsi="BRH Malayalam Extra" w:cs="BRH Devanagari Extra"/>
-                <w:color w:val="000000"/>
-                <w:sz w:val="32"/>
-                <w:szCs w:val="40"/>
-              </w:rPr>
-              <w:t>–</w:t>
-            </w:r>
-            <w:r>
-              <w:rPr>
-                <w:rFonts w:ascii="BRH Devanagari Extra" w:hAnsi="BRH Devanagari Extra" w:cs="BRH Devanagari Extra"/>
-                <w:color w:val="000000"/>
-                <w:sz w:val="40"/>
-                <w:szCs w:val="40"/>
-              </w:rPr>
-              <w:t xml:space="preserve"> ÌWû |</w:t>
+            <w:proofErr w:type="spellEnd"/>
+            <w:r>
+              <w:rPr>
+                <w:rFonts w:ascii="BRH Malayalam Extra" w:hAnsi="BRH Malayalam Extra" w:cs="BRH Devanagari Extra"/>
+                <w:color w:val="000000"/>
+                <w:sz w:val="32"/>
+                <w:szCs w:val="40"/>
+              </w:rPr>
+              <w:t>–</w:t>
+            </w:r>
+            <w:r>
+              <w:rPr>
+                <w:rFonts w:ascii="BRH Devanagari Extra" w:hAnsi="BRH Devanagari Extra" w:cs="BRH Devanagari Extra"/>
+                <w:color w:val="000000"/>
+                <w:sz w:val="40"/>
+                <w:szCs w:val="40"/>
+              </w:rPr>
+              <w:t xml:space="preserve"> </w:t>
+            </w:r>
+            <w:proofErr w:type="spellStart"/>
+            <w:r>
+              <w:rPr>
+                <w:rFonts w:ascii="BRH Devanagari Extra" w:hAnsi="BRH Devanagari Extra" w:cs="BRH Devanagari Extra"/>
+                <w:color w:val="000000"/>
+                <w:sz w:val="40"/>
+                <w:szCs w:val="40"/>
+              </w:rPr>
+              <w:t>ÌWû</w:t>
+            </w:r>
+            <w:proofErr w:type="spellEnd"/>
+            <w:r>
+              <w:rPr>
+                <w:rFonts w:ascii="BRH Devanagari Extra" w:hAnsi="BRH Devanagari Extra" w:cs="BRH Devanagari Extra"/>
+                <w:color w:val="000000"/>
+                <w:sz w:val="40"/>
+                <w:szCs w:val="40"/>
+              </w:rPr>
+              <w:t xml:space="preserve"> |</w:t>
             </w:r>
           </w:p>
         </w:tc>
@@ -3915,17 +5236,29 @@
                 <w:sz w:val="40"/>
                 <w:szCs w:val="40"/>
               </w:rPr>
-              <w:t xml:space="preserve"> qÉå</w:t>
-            </w:r>
-            <w:r>
-              <w:rPr>
-                <w:rFonts w:ascii="BRH Malayalam Extra" w:hAnsi="BRH Malayalam Extra" w:cs="BRH Devanagari Extra"/>
-                <w:color w:val="000000"/>
-                <w:sz w:val="32"/>
-                <w:szCs w:val="40"/>
-              </w:rPr>
-              <w:t>–</w:t>
-            </w:r>
+              <w:t xml:space="preserve"> </w:t>
+            </w:r>
+            <w:proofErr w:type="spellStart"/>
+            <w:r>
+              <w:rPr>
+                <w:rFonts w:ascii="BRH Devanagari Extra" w:hAnsi="BRH Devanagari Extra" w:cs="BRH Devanagari Extra"/>
+                <w:color w:val="000000"/>
+                <w:sz w:val="40"/>
+                <w:szCs w:val="40"/>
+              </w:rPr>
+              <w:t>qÉå</w:t>
+            </w:r>
+            <w:proofErr w:type="spellEnd"/>
+            <w:r>
+              <w:rPr>
+                <w:rFonts w:ascii="BRH Malayalam Extra" w:hAnsi="BRH Malayalam Extra" w:cs="BRH Devanagari Extra"/>
+                <w:color w:val="000000"/>
+                <w:sz w:val="32"/>
+                <w:szCs w:val="40"/>
+              </w:rPr>
+              <w:t>–</w:t>
+            </w:r>
+            <w:proofErr w:type="spellStart"/>
             <w:r>
               <w:rPr>
                 <w:rFonts w:ascii="BRH Devanagari Extra" w:hAnsi="BRH Devanagari Extra" w:cs="BRH Devanagari Extra"/>
@@ -3942,17 +5275,39 @@
                 <w:sz w:val="40"/>
                 <w:szCs w:val="40"/>
               </w:rPr>
-              <w:t>rÉÉÿ | qÉå</w:t>
-            </w:r>
-            <w:r>
-              <w:rPr>
-                <w:rFonts w:ascii="BRH Malayalam Extra" w:hAnsi="BRH Malayalam Extra" w:cs="BRH Devanagari Extra"/>
-                <w:color w:val="000000"/>
-                <w:sz w:val="32"/>
-                <w:szCs w:val="40"/>
-              </w:rPr>
-              <w:t>–</w:t>
-            </w:r>
+              <w:t>rÉÉÿ</w:t>
+            </w:r>
+            <w:proofErr w:type="spellEnd"/>
+            <w:r>
+              <w:rPr>
+                <w:rFonts w:ascii="BRH Devanagari Extra" w:hAnsi="BRH Devanagari Extra" w:cs="BRH Devanagari Extra"/>
+                <w:color w:val="000000"/>
+                <w:sz w:val="40"/>
+                <w:szCs w:val="40"/>
+              </w:rPr>
+              <w:t xml:space="preserve"> | </w:t>
+            </w:r>
+            <w:proofErr w:type="spellStart"/>
+            <w:r>
+              <w:rPr>
+                <w:rFonts w:ascii="BRH Devanagari Extra" w:hAnsi="BRH Devanagari Extra" w:cs="BRH Devanagari Extra"/>
+                <w:color w:val="000000"/>
+                <w:sz w:val="40"/>
+                <w:szCs w:val="40"/>
+              </w:rPr>
+              <w:t>qÉå</w:t>
+            </w:r>
+            <w:proofErr w:type="spellEnd"/>
+            <w:r>
+              <w:rPr>
+                <w:rFonts w:ascii="BRH Malayalam Extra" w:hAnsi="BRH Malayalam Extra" w:cs="BRH Devanagari Extra"/>
+                <w:color w:val="000000"/>
+                <w:sz w:val="32"/>
+                <w:szCs w:val="40"/>
+              </w:rPr>
+              <w:t>–</w:t>
+            </w:r>
+            <w:proofErr w:type="spellStart"/>
             <w:r>
               <w:rPr>
                 <w:rFonts w:ascii="BRH Devanagari Extra" w:hAnsi="BRH Devanagari Extra" w:cs="BRH Devanagari Extra"/>
@@ -3971,23 +5326,44 @@
               </w:rPr>
               <w:t>rÉÉ</w:t>
             </w:r>
-            <w:r>
-              <w:rPr>
-                <w:rFonts w:ascii="BRH Malayalam Extra" w:hAnsi="BRH Malayalam Extra" w:cs="BRH Devanagari Extra"/>
-                <w:color w:val="000000"/>
-                <w:sz w:val="32"/>
-                <w:szCs w:val="40"/>
-              </w:rPr>
-              <w:t>–</w:t>
-            </w:r>
-            <w:r>
-              <w:rPr>
-                <w:rFonts w:ascii="BRH Devanagari Extra" w:hAnsi="BRH Devanagari Extra" w:cs="BRH Devanagari Extra"/>
-                <w:color w:val="000000"/>
-                <w:sz w:val="40"/>
-                <w:szCs w:val="40"/>
-              </w:rPr>
-              <w:t xml:space="preserve"> ÌWû |</w:t>
+            <w:proofErr w:type="spellEnd"/>
+            <w:r>
+              <w:rPr>
+                <w:rFonts w:ascii="BRH Malayalam Extra" w:hAnsi="BRH Malayalam Extra" w:cs="BRH Devanagari Extra"/>
+                <w:color w:val="000000"/>
+                <w:sz w:val="32"/>
+                <w:szCs w:val="40"/>
+              </w:rPr>
+              <w:t>–</w:t>
+            </w:r>
+            <w:r>
+              <w:rPr>
+                <w:rFonts w:ascii="BRH Devanagari Extra" w:hAnsi="BRH Devanagari Extra" w:cs="BRH Devanagari Extra"/>
+                <w:color w:val="000000"/>
+                <w:sz w:val="40"/>
+                <w:szCs w:val="40"/>
+              </w:rPr>
+              <w:t xml:space="preserve"> </w:t>
+            </w:r>
+            <w:proofErr w:type="spellStart"/>
+            <w:r>
+              <w:rPr>
+                <w:rFonts w:ascii="BRH Devanagari Extra" w:hAnsi="BRH Devanagari Extra" w:cs="BRH Devanagari Extra"/>
+                <w:color w:val="000000"/>
+                <w:sz w:val="40"/>
+                <w:szCs w:val="40"/>
+              </w:rPr>
+              <w:t>ÌWû</w:t>
+            </w:r>
+            <w:proofErr w:type="spellEnd"/>
+            <w:r>
+              <w:rPr>
+                <w:rFonts w:ascii="BRH Devanagari Extra" w:hAnsi="BRH Devanagari Extra" w:cs="BRH Devanagari Extra"/>
+                <w:color w:val="000000"/>
+                <w:sz w:val="40"/>
+                <w:szCs w:val="40"/>
+              </w:rPr>
+              <w:t xml:space="preserve"> |</w:t>
             </w:r>
           </w:p>
         </w:tc>
@@ -4117,6 +5493,7 @@
                 <w:szCs w:val="40"/>
               </w:rPr>
             </w:pPr>
+            <w:proofErr w:type="spellStart"/>
             <w:r>
               <w:rPr>
                 <w:rFonts w:ascii="BRH Devanagari Extra" w:hAnsi="BRH Devanagari Extra" w:cs="BRH Devanagari Extra"/>
@@ -4126,24 +5503,46 @@
               </w:rPr>
               <w:t>AÌiÉþ¸qÉÉlÉå</w:t>
             </w:r>
-            <w:r>
-              <w:rPr>
-                <w:rFonts w:ascii="BRH Malayalam Extra" w:hAnsi="BRH Malayalam Extra" w:cs="BRH Devanagari Extra"/>
-                <w:color w:val="000000"/>
-                <w:sz w:val="32"/>
-                <w:szCs w:val="40"/>
-              </w:rPr>
-              <w:t>–</w:t>
-            </w:r>
-            <w:r>
-              <w:rPr>
-                <w:rFonts w:ascii="BRH Devanagari Extra" w:hAnsi="BRH Devanagari Extra" w:cs="BRH Devanagari Extra"/>
-                <w:color w:val="000000"/>
-                <w:sz w:val="40"/>
-                <w:szCs w:val="40"/>
-              </w:rPr>
-              <w:t xml:space="preserve"> CirÉÌiÉþ¸ - </w:t>
-            </w:r>
+            <w:proofErr w:type="spellEnd"/>
+            <w:r>
+              <w:rPr>
+                <w:rFonts w:ascii="BRH Malayalam Extra" w:hAnsi="BRH Malayalam Extra" w:cs="BRH Devanagari Extra"/>
+                <w:color w:val="000000"/>
+                <w:sz w:val="32"/>
+                <w:szCs w:val="40"/>
+              </w:rPr>
+              <w:t>–</w:t>
+            </w:r>
+            <w:r>
+              <w:rPr>
+                <w:rFonts w:ascii="BRH Devanagari Extra" w:hAnsi="BRH Devanagari Extra" w:cs="BRH Devanagari Extra"/>
+                <w:color w:val="000000"/>
+                <w:sz w:val="40"/>
+                <w:szCs w:val="40"/>
+              </w:rPr>
+              <w:t xml:space="preserve"> </w:t>
+            </w:r>
+            <w:proofErr w:type="spellStart"/>
+            <w:r>
+              <w:rPr>
+                <w:rFonts w:ascii="BRH Devanagari Extra" w:hAnsi="BRH Devanagari Extra" w:cs="BRH Devanagari Extra"/>
+                <w:color w:val="000000"/>
+                <w:sz w:val="40"/>
+                <w:szCs w:val="40"/>
+              </w:rPr>
+              <w:t>CirÉÌiÉþ</w:t>
+            </w:r>
+            <w:proofErr w:type="spellEnd"/>
+            <w:r>
+              <w:rPr>
+                <w:rFonts w:ascii="BRH Devanagari Extra" w:hAnsi="BRH Devanagari Extra" w:cs="BRH Devanagari Extra"/>
+                <w:color w:val="000000"/>
+                <w:sz w:val="40"/>
+                <w:szCs w:val="40"/>
+              </w:rPr>
+              <w:t xml:space="preserve">¸ - </w:t>
+            </w:r>
+            <w:proofErr w:type="spellStart"/>
             <w:r>
               <w:rPr>
                 <w:rFonts w:ascii="BRH Devanagari Extra" w:hAnsi="BRH Devanagari Extra" w:cs="BRH Devanagari Extra"/>
@@ -4154,6 +5553,7 @@
               </w:rPr>
               <w:t>qÉÉlÉå</w:t>
             </w:r>
+            <w:proofErr w:type="spellEnd"/>
             <w:r>
               <w:rPr>
                 <w:rFonts w:ascii="BRH Devanagari Extra" w:hAnsi="BRH Devanagari Extra" w:cs="BRH Devanagari Extra"/>
@@ -4183,6 +5583,7 @@
                 <w:szCs w:val="40"/>
               </w:rPr>
             </w:pPr>
+            <w:proofErr w:type="spellStart"/>
             <w:r>
               <w:rPr>
                 <w:rFonts w:ascii="BRH Devanagari Extra" w:hAnsi="BRH Devanagari Extra" w:cs="BRH Devanagari Extra"/>
@@ -4192,23 +5593,34 @@
               </w:rPr>
               <w:t>AÌiÉþ¸qÉÉlÉå</w:t>
             </w:r>
-            <w:r>
-              <w:rPr>
-                <w:rFonts w:ascii="BRH Malayalam Extra" w:hAnsi="BRH Malayalam Extra" w:cs="BRH Devanagari Extra"/>
-                <w:color w:val="000000"/>
-                <w:sz w:val="32"/>
-                <w:szCs w:val="40"/>
-              </w:rPr>
-              <w:t>–</w:t>
-            </w:r>
-            <w:r>
-              <w:rPr>
-                <w:rFonts w:ascii="BRH Devanagari Extra" w:hAnsi="BRH Devanagari Extra" w:cs="BRH Devanagari Extra"/>
-                <w:color w:val="000000"/>
-                <w:sz w:val="40"/>
-                <w:szCs w:val="40"/>
-              </w:rPr>
-              <w:t xml:space="preserve"> CirÉÌiÉþ¸</w:t>
+            <w:proofErr w:type="spellEnd"/>
+            <w:r>
+              <w:rPr>
+                <w:rFonts w:ascii="BRH Malayalam Extra" w:hAnsi="BRH Malayalam Extra" w:cs="BRH Devanagari Extra"/>
+                <w:color w:val="000000"/>
+                <w:sz w:val="32"/>
+                <w:szCs w:val="40"/>
+              </w:rPr>
+              <w:t>–</w:t>
+            </w:r>
+            <w:r>
+              <w:rPr>
+                <w:rFonts w:ascii="BRH Devanagari Extra" w:hAnsi="BRH Devanagari Extra" w:cs="BRH Devanagari Extra"/>
+                <w:color w:val="000000"/>
+                <w:sz w:val="40"/>
+                <w:szCs w:val="40"/>
+              </w:rPr>
+              <w:t xml:space="preserve"> </w:t>
+            </w:r>
+            <w:proofErr w:type="spellStart"/>
+            <w:r>
+              <w:rPr>
+                <w:rFonts w:ascii="BRH Devanagari Extra" w:hAnsi="BRH Devanagari Extra" w:cs="BRH Devanagari Extra"/>
+                <w:color w:val="000000"/>
+                <w:sz w:val="40"/>
+                <w:szCs w:val="40"/>
+              </w:rPr>
+              <w:t>CirÉÌiÉþ¸</w:t>
             </w:r>
             <w:r>
               <w:rPr>
@@ -4229,6 +5641,7 @@
               </w:rPr>
               <w:t>å</w:t>
             </w:r>
+            <w:proofErr w:type="spellEnd"/>
             <w:r>
               <w:rPr>
                 <w:rFonts w:ascii="BRH Devanagari Extra" w:hAnsi="BRH Devanagari Extra" w:cs="BRH Devanagari Extra"/>
@@ -4444,14 +5857,35 @@
               </w:rPr>
               <w:t>–</w:t>
             </w:r>
-            <w:r>
-              <w:rPr>
-                <w:rFonts w:ascii="BRH Devanagari Extra" w:hAnsi="BRH Devanagari Extra" w:cs="BRH Devanagari Extra"/>
-                <w:color w:val="000000"/>
-                <w:sz w:val="40"/>
-                <w:szCs w:val="40"/>
-              </w:rPr>
-              <w:t>qÉå C</w:t>
+            <w:proofErr w:type="spellStart"/>
+            <w:r>
+              <w:rPr>
+                <w:rFonts w:ascii="BRH Devanagari Extra" w:hAnsi="BRH Devanagari Extra" w:cs="BRH Devanagari Extra"/>
+                <w:color w:val="000000"/>
+                <w:sz w:val="40"/>
+                <w:szCs w:val="40"/>
+              </w:rPr>
+              <w:t>qÉå</w:t>
+            </w:r>
+            <w:proofErr w:type="spellEnd"/>
+            <w:r>
+              <w:rPr>
+                <w:rFonts w:ascii="BRH Devanagari Extra" w:hAnsi="BRH Devanagari Extra" w:cs="BRH Devanagari Extra"/>
+                <w:color w:val="000000"/>
+                <w:sz w:val="40"/>
+                <w:szCs w:val="40"/>
+              </w:rPr>
+              <w:t xml:space="preserve"> </w:t>
+            </w:r>
+            <w:proofErr w:type="spellStart"/>
+            <w:r>
+              <w:rPr>
+                <w:rFonts w:ascii="BRH Devanagari Extra" w:hAnsi="BRH Devanagari Extra" w:cs="BRH Devanagari Extra"/>
+                <w:color w:val="000000"/>
+                <w:sz w:val="40"/>
+                <w:szCs w:val="40"/>
+              </w:rPr>
+              <w:t>C</w:t>
             </w:r>
             <w:r>
               <w:rPr>
@@ -4470,7 +5904,17 @@
                 <w:sz w:val="40"/>
                 <w:szCs w:val="40"/>
               </w:rPr>
-              <w:t>þqÉå |</w:t>
+              <w:t>þqÉå</w:t>
+            </w:r>
+            <w:proofErr w:type="spellEnd"/>
+            <w:r>
+              <w:rPr>
+                <w:rFonts w:ascii="BRH Devanagari Extra" w:hAnsi="BRH Devanagari Extra" w:cs="BRH Devanagari Extra"/>
+                <w:color w:val="000000"/>
+                <w:sz w:val="40"/>
+                <w:szCs w:val="40"/>
+              </w:rPr>
+              <w:t xml:space="preserve"> |</w:t>
             </w:r>
           </w:p>
         </w:tc>
@@ -4506,14 +5950,35 @@
               </w:rPr>
               <w:t>–</w:t>
             </w:r>
-            <w:r>
-              <w:rPr>
-                <w:rFonts w:ascii="BRH Devanagari Extra" w:hAnsi="BRH Devanagari Extra" w:cs="BRH Devanagari Extra"/>
-                <w:color w:val="000000"/>
-                <w:sz w:val="40"/>
-                <w:szCs w:val="40"/>
-              </w:rPr>
-              <w:t>qÉå C</w:t>
+            <w:proofErr w:type="spellStart"/>
+            <w:r>
+              <w:rPr>
+                <w:rFonts w:ascii="BRH Devanagari Extra" w:hAnsi="BRH Devanagari Extra" w:cs="BRH Devanagari Extra"/>
+                <w:color w:val="000000"/>
+                <w:sz w:val="40"/>
+                <w:szCs w:val="40"/>
+              </w:rPr>
+              <w:t>qÉå</w:t>
+            </w:r>
+            <w:proofErr w:type="spellEnd"/>
+            <w:r>
+              <w:rPr>
+                <w:rFonts w:ascii="BRH Devanagari Extra" w:hAnsi="BRH Devanagari Extra" w:cs="BRH Devanagari Extra"/>
+                <w:color w:val="000000"/>
+                <w:sz w:val="40"/>
+                <w:szCs w:val="40"/>
+              </w:rPr>
+              <w:t xml:space="preserve"> </w:t>
+            </w:r>
+            <w:proofErr w:type="spellStart"/>
+            <w:r>
+              <w:rPr>
+                <w:rFonts w:ascii="BRH Devanagari Extra" w:hAnsi="BRH Devanagari Extra" w:cs="BRH Devanagari Extra"/>
+                <w:color w:val="000000"/>
+                <w:sz w:val="40"/>
+                <w:szCs w:val="40"/>
+              </w:rPr>
+              <w:t>C</w:t>
             </w:r>
             <w:r>
               <w:rPr>
@@ -4525,6 +5990,7 @@
               </w:rPr>
               <w:t>iÉÏ</w:t>
             </w:r>
+            <w:proofErr w:type="spellEnd"/>
             <w:r>
               <w:rPr>
                 <w:rFonts w:ascii="BRH Malayalam Extra" w:hAnsi="BRH Malayalam Extra" w:cs="BRH Devanagari Extra"/>
@@ -4535,14 +6001,25 @@
               </w:rPr>
               <w:t>–</w:t>
             </w:r>
-            <w:r>
-              <w:rPr>
-                <w:rFonts w:ascii="BRH Devanagari Extra" w:hAnsi="BRH Devanagari Extra" w:cs="BRH Devanagari Extra"/>
-                <w:color w:val="000000"/>
-                <w:sz w:val="40"/>
-                <w:szCs w:val="40"/>
-              </w:rPr>
-              <w:t>qÉå |</w:t>
+            <w:proofErr w:type="spellStart"/>
+            <w:r>
+              <w:rPr>
+                <w:rFonts w:ascii="BRH Devanagari Extra" w:hAnsi="BRH Devanagari Extra" w:cs="BRH Devanagari Extra"/>
+                <w:color w:val="000000"/>
+                <w:sz w:val="40"/>
+                <w:szCs w:val="40"/>
+              </w:rPr>
+              <w:t>qÉå</w:t>
+            </w:r>
+            <w:proofErr w:type="spellEnd"/>
+            <w:r>
+              <w:rPr>
+                <w:rFonts w:ascii="BRH Devanagari Extra" w:hAnsi="BRH Devanagari Extra" w:cs="BRH Devanagari Extra"/>
+                <w:color w:val="000000"/>
+                <w:sz w:val="40"/>
+                <w:szCs w:val="40"/>
+              </w:rPr>
+              <w:t xml:space="preserve"> |</w:t>
             </w:r>
           </w:p>
         </w:tc>
@@ -4686,6 +6163,7 @@
               </w:rPr>
               <w:t>–</w:t>
             </w:r>
+            <w:proofErr w:type="spellStart"/>
             <w:r>
               <w:rPr>
                 <w:rFonts w:ascii="BRH Devanagari Extra" w:hAnsi="BRH Devanagari Extra" w:cs="BRH Devanagari Extra"/>
@@ -4695,6 +6173,7 @@
               </w:rPr>
               <w:t>iqÉÉlÉ</w:t>
             </w:r>
+            <w:proofErr w:type="spellEnd"/>
             <w:r>
               <w:rPr>
                 <w:rFonts w:ascii="BRH Malayalam Extra" w:hAnsi="BRH Malayalam Extra" w:cs="BRH Devanagari Extra"/>
@@ -4730,7 +6209,27 @@
                 <w:sz w:val="40"/>
                 <w:szCs w:val="40"/>
               </w:rPr>
-              <w:t xml:space="preserve"> | ÌlÉw¢üÏþhÉÏwuÉ |</w:t>
+              <w:t xml:space="preserve"> | </w:t>
+            </w:r>
+            <w:proofErr w:type="spellStart"/>
+            <w:r>
+              <w:rPr>
+                <w:rFonts w:ascii="BRH Devanagari Extra" w:hAnsi="BRH Devanagari Extra" w:cs="BRH Devanagari Extra"/>
+                <w:color w:val="000000"/>
+                <w:sz w:val="40"/>
+                <w:szCs w:val="40"/>
+              </w:rPr>
+              <w:t>ÌlÉw¢üÏþhÉÏwuÉ</w:t>
+            </w:r>
+            <w:proofErr w:type="spellEnd"/>
+            <w:r>
+              <w:rPr>
+                <w:rFonts w:ascii="BRH Devanagari Extra" w:hAnsi="BRH Devanagari Extra" w:cs="BRH Devanagari Extra"/>
+                <w:color w:val="000000"/>
+                <w:sz w:val="40"/>
+                <w:szCs w:val="40"/>
+              </w:rPr>
+              <w:t xml:space="preserve"> |</w:t>
             </w:r>
           </w:p>
         </w:tc>
@@ -4770,6 +6269,7 @@
               </w:rPr>
               <w:t>–</w:t>
             </w:r>
+            <w:proofErr w:type="spellStart"/>
             <w:r>
               <w:rPr>
                 <w:rFonts w:ascii="BRH Devanagari Extra" w:hAnsi="BRH Devanagari Extra" w:cs="BRH Devanagari Extra"/>
@@ -4779,6 +6279,7 @@
               </w:rPr>
               <w:t>iqÉÉlÉ</w:t>
             </w:r>
+            <w:proofErr w:type="spellEnd"/>
             <w:r>
               <w:rPr>
                 <w:rFonts w:ascii="BRH Malayalam Extra" w:hAnsi="BRH Malayalam Extra" w:cs="BRH Devanagari Extra"/>
@@ -4797,6 +6298,7 @@
               </w:rPr>
               <w:t xml:space="preserve">qÉç </w:t>
             </w:r>
+            <w:proofErr w:type="spellStart"/>
             <w:r>
               <w:rPr>
                 <w:rFonts w:ascii="BRH Devanagari Extra" w:hAnsi="BRH Devanagari Extra" w:cs="BRH Devanagari Extra"/>
@@ -4807,14 +6309,35 @@
               </w:rPr>
               <w:t>ÌlÉÈ</w:t>
             </w:r>
-            <w:r>
-              <w:rPr>
-                <w:rFonts w:ascii="BRH Devanagari Extra" w:hAnsi="BRH Devanagari Extra" w:cs="BRH Devanagari Extra"/>
-                <w:color w:val="000000"/>
-                <w:sz w:val="40"/>
-                <w:szCs w:val="40"/>
-              </w:rPr>
-              <w:t xml:space="preserve"> | ÌlÉw¢üÏþhÉÏwuÉ |</w:t>
+            <w:proofErr w:type="spellEnd"/>
+            <w:r>
+              <w:rPr>
+                <w:rFonts w:ascii="BRH Devanagari Extra" w:hAnsi="BRH Devanagari Extra" w:cs="BRH Devanagari Extra"/>
+                <w:color w:val="000000"/>
+                <w:sz w:val="40"/>
+                <w:szCs w:val="40"/>
+              </w:rPr>
+              <w:t xml:space="preserve"> | </w:t>
+            </w:r>
+            <w:proofErr w:type="spellStart"/>
+            <w:r>
+              <w:rPr>
+                <w:rFonts w:ascii="BRH Devanagari Extra" w:hAnsi="BRH Devanagari Extra" w:cs="BRH Devanagari Extra"/>
+                <w:color w:val="000000"/>
+                <w:sz w:val="40"/>
+                <w:szCs w:val="40"/>
+              </w:rPr>
+              <w:t>ÌlÉw¢üÏþhÉÏwuÉ</w:t>
+            </w:r>
+            <w:proofErr w:type="spellEnd"/>
+            <w:r>
+              <w:rPr>
+                <w:rFonts w:ascii="BRH Devanagari Extra" w:hAnsi="BRH Devanagari Extra" w:cs="BRH Devanagari Extra"/>
+                <w:color w:val="000000"/>
+                <w:sz w:val="40"/>
+                <w:szCs w:val="40"/>
+              </w:rPr>
+              <w:t xml:space="preserve"> |</w:t>
             </w:r>
           </w:p>
         </w:tc>
@@ -4962,15 +6485,27 @@
               </w:rPr>
               <w:t>–</w:t>
             </w:r>
-            <w:r>
-              <w:rPr>
-                <w:rFonts w:ascii="BRH Devanagari Extra" w:hAnsi="BRH Devanagari Extra" w:cs="BRH Devanagari Extra"/>
-                <w:color w:val="000000"/>
-                <w:sz w:val="40"/>
-                <w:szCs w:val="40"/>
-              </w:rPr>
-              <w:t xml:space="preserve">SqÉç </w:t>
-            </w:r>
+            <w:proofErr w:type="spellStart"/>
+            <w:r>
+              <w:rPr>
+                <w:rFonts w:ascii="BRH Devanagari Extra" w:hAnsi="BRH Devanagari Extra" w:cs="BRH Devanagari Extra"/>
+                <w:color w:val="000000"/>
+                <w:sz w:val="40"/>
+                <w:szCs w:val="40"/>
+              </w:rPr>
+              <w:t>SqÉç</w:t>
+            </w:r>
+            <w:proofErr w:type="spellEnd"/>
+            <w:r>
+              <w:rPr>
+                <w:rFonts w:ascii="BRH Devanagari Extra" w:hAnsi="BRH Devanagari Extra" w:cs="BRH Devanagari Extra"/>
+                <w:color w:val="000000"/>
+                <w:sz w:val="40"/>
+                <w:szCs w:val="40"/>
+              </w:rPr>
+              <w:t xml:space="preserve"> </w:t>
+            </w:r>
+            <w:proofErr w:type="spellStart"/>
             <w:r>
               <w:rPr>
                 <w:rFonts w:ascii="BRH Devanagari Extra" w:hAnsi="BRH Devanagari Extra" w:cs="BRH Devanagari Extra"/>
@@ -4981,15 +6516,17 @@
               </w:rPr>
               <w:t>ÆrÉÉ</w:t>
             </w:r>
-            <w:r>
-              <w:rPr>
-                <w:rFonts w:ascii="BRH Malayalam Extra" w:hAnsi="BRH Malayalam Extra" w:cs="BRH Devanagari Extra"/>
-                <w:color w:val="000000"/>
-                <w:sz w:val="32"/>
-                <w:szCs w:val="40"/>
-              </w:rPr>
-              <w:t>–</w:t>
-            </w:r>
+            <w:proofErr w:type="spellEnd"/>
+            <w:r>
+              <w:rPr>
+                <w:rFonts w:ascii="BRH Malayalam Extra" w:hAnsi="BRH Malayalam Extra" w:cs="BRH Devanagari Extra"/>
+                <w:color w:val="000000"/>
+                <w:sz w:val="32"/>
+                <w:szCs w:val="40"/>
+              </w:rPr>
+              <w:t>–</w:t>
+            </w:r>
+            <w:proofErr w:type="spellStart"/>
             <w:r>
               <w:rPr>
                 <w:rFonts w:ascii="BRH Devanagari Extra" w:hAnsi="BRH Devanagari Extra" w:cs="BRH Devanagari Extra"/>
@@ -4999,23 +6536,35 @@
               </w:rPr>
               <w:t>uÉiÉçiqÉÔ</w:t>
             </w:r>
-            <w:r>
-              <w:rPr>
-                <w:rFonts w:ascii="BRH Malayalam Extra" w:hAnsi="BRH Malayalam Extra" w:cs="BRH Devanagari Extra"/>
-                <w:color w:val="000000"/>
-                <w:sz w:val="32"/>
-                <w:szCs w:val="40"/>
-              </w:rPr>
-              <w:t>–</w:t>
-            </w:r>
-            <w:r>
-              <w:rPr>
-                <w:rFonts w:ascii="BRH Devanagari Extra" w:hAnsi="BRH Devanagari Extra" w:cs="BRH Devanagari Extra"/>
-                <w:color w:val="000000"/>
-                <w:sz w:val="40"/>
-                <w:szCs w:val="40"/>
-              </w:rPr>
-              <w:t xml:space="preserve">iÉqÉç | </w:t>
+            <w:proofErr w:type="spellEnd"/>
+            <w:r>
+              <w:rPr>
+                <w:rFonts w:ascii="BRH Malayalam Extra" w:hAnsi="BRH Malayalam Extra" w:cs="BRH Devanagari Extra"/>
+                <w:color w:val="000000"/>
+                <w:sz w:val="32"/>
+                <w:szCs w:val="40"/>
+              </w:rPr>
+              <w:t>–</w:t>
+            </w:r>
+            <w:proofErr w:type="spellStart"/>
+            <w:r>
+              <w:rPr>
+                <w:rFonts w:ascii="BRH Devanagari Extra" w:hAnsi="BRH Devanagari Extra" w:cs="BRH Devanagari Extra"/>
+                <w:color w:val="000000"/>
+                <w:sz w:val="40"/>
+                <w:szCs w:val="40"/>
+              </w:rPr>
+              <w:t>iÉqÉç</w:t>
+            </w:r>
+            <w:proofErr w:type="spellEnd"/>
+            <w:r>
+              <w:rPr>
+                <w:rFonts w:ascii="BRH Devanagari Extra" w:hAnsi="BRH Devanagari Extra" w:cs="BRH Devanagari Extra"/>
+                <w:color w:val="000000"/>
+                <w:sz w:val="40"/>
+                <w:szCs w:val="40"/>
+              </w:rPr>
+              <w:t xml:space="preserve"> | </w:t>
             </w:r>
           </w:p>
           <w:p>
@@ -5032,6 +6581,7 @@
                 <w:szCs w:val="40"/>
               </w:rPr>
             </w:pPr>
+            <w:proofErr w:type="spellStart"/>
             <w:r>
               <w:rPr>
                 <w:rFonts w:ascii="BRH Devanagari Extra" w:hAnsi="BRH Devanagari Extra" w:cs="BRH Devanagari Extra"/>
@@ -5041,6 +6591,7 @@
               </w:rPr>
               <w:t>rÉÉ</w:t>
             </w:r>
+            <w:proofErr w:type="spellEnd"/>
             <w:r>
               <w:rPr>
                 <w:rFonts w:ascii="BRH Malayalam Extra" w:hAnsi="BRH Malayalam Extra" w:cs="BRH Devanagari Extra"/>
@@ -5068,6 +6619,7 @@
               </w:rPr>
               <w:t>–</w:t>
             </w:r>
+            <w:proofErr w:type="spellStart"/>
             <w:r>
               <w:rPr>
                 <w:rFonts w:ascii="BRH Devanagari Extra" w:hAnsi="BRH Devanagari Extra" w:cs="BRH Devanagari Extra"/>
@@ -5077,15 +6629,17 @@
               </w:rPr>
               <w:t>iÉçiqÉÔ</w:t>
             </w:r>
-            <w:r>
-              <w:rPr>
-                <w:rFonts w:ascii="BRH Malayalam Extra" w:hAnsi="BRH Malayalam Extra" w:cs="BRH Devanagari Extra"/>
-                <w:color w:val="000000"/>
-                <w:sz w:val="32"/>
-                <w:szCs w:val="40"/>
-              </w:rPr>
-              <w:t>–</w:t>
-            </w:r>
+            <w:proofErr w:type="spellEnd"/>
+            <w:r>
+              <w:rPr>
+                <w:rFonts w:ascii="BRH Malayalam Extra" w:hAnsi="BRH Malayalam Extra" w:cs="BRH Devanagari Extra"/>
+                <w:color w:val="000000"/>
+                <w:sz w:val="32"/>
+                <w:szCs w:val="40"/>
+              </w:rPr>
+              <w:t>–</w:t>
+            </w:r>
+            <w:proofErr w:type="spellStart"/>
             <w:r>
               <w:rPr>
                 <w:rFonts w:ascii="BRH Devanagari Extra" w:hAnsi="BRH Devanagari Extra" w:cs="BRH Devanagari Extra"/>
@@ -5104,14 +6658,35 @@
               </w:rPr>
               <w:t>óè</w:t>
             </w:r>
-            <w:r>
-              <w:rPr>
-                <w:rFonts w:ascii="BRH Devanagari Extra" w:hAnsi="BRH Devanagari Extra" w:cs="BRH Devanagari Extra"/>
-                <w:color w:val="000000"/>
-                <w:sz w:val="40"/>
-                <w:szCs w:val="40"/>
-              </w:rPr>
-              <w:t xml:space="preserve"> xÉqÉç |</w:t>
+            <w:proofErr w:type="spellEnd"/>
+            <w:r>
+              <w:rPr>
+                <w:rFonts w:ascii="BRH Devanagari Extra" w:hAnsi="BRH Devanagari Extra" w:cs="BRH Devanagari Extra"/>
+                <w:color w:val="000000"/>
+                <w:sz w:val="40"/>
+                <w:szCs w:val="40"/>
+              </w:rPr>
+              <w:t xml:space="preserve"> </w:t>
+            </w:r>
+            <w:proofErr w:type="spellStart"/>
+            <w:r>
+              <w:rPr>
+                <w:rFonts w:ascii="BRH Devanagari Extra" w:hAnsi="BRH Devanagari Extra" w:cs="BRH Devanagari Extra"/>
+                <w:color w:val="000000"/>
+                <w:sz w:val="40"/>
+                <w:szCs w:val="40"/>
+              </w:rPr>
+              <w:t>xÉqÉç</w:t>
+            </w:r>
+            <w:proofErr w:type="spellEnd"/>
+            <w:r>
+              <w:rPr>
+                <w:rFonts w:ascii="BRH Devanagari Extra" w:hAnsi="BRH Devanagari Extra" w:cs="BRH Devanagari Extra"/>
+                <w:color w:val="000000"/>
+                <w:sz w:val="40"/>
+                <w:szCs w:val="40"/>
+              </w:rPr>
+              <w:t xml:space="preserve"> |</w:t>
             </w:r>
           </w:p>
         </w:tc>
@@ -5151,15 +6726,27 @@
               </w:rPr>
               <w:t>–</w:t>
             </w:r>
-            <w:r>
-              <w:rPr>
-                <w:rFonts w:ascii="BRH Devanagari Extra" w:hAnsi="BRH Devanagari Extra" w:cs="BRH Devanagari Extra"/>
-                <w:color w:val="000000"/>
-                <w:sz w:val="40"/>
-                <w:szCs w:val="40"/>
-              </w:rPr>
-              <w:t xml:space="preserve">SqÉç </w:t>
-            </w:r>
+            <w:proofErr w:type="spellStart"/>
+            <w:r>
+              <w:rPr>
+                <w:rFonts w:ascii="BRH Devanagari Extra" w:hAnsi="BRH Devanagari Extra" w:cs="BRH Devanagari Extra"/>
+                <w:color w:val="000000"/>
+                <w:sz w:val="40"/>
+                <w:szCs w:val="40"/>
+              </w:rPr>
+              <w:t>SqÉç</w:t>
+            </w:r>
+            <w:proofErr w:type="spellEnd"/>
+            <w:r>
+              <w:rPr>
+                <w:rFonts w:ascii="BRH Devanagari Extra" w:hAnsi="BRH Devanagari Extra" w:cs="BRH Devanagari Extra"/>
+                <w:color w:val="000000"/>
+                <w:sz w:val="40"/>
+                <w:szCs w:val="40"/>
+              </w:rPr>
+              <w:t xml:space="preserve"> </w:t>
+            </w:r>
+            <w:proofErr w:type="spellStart"/>
             <w:r>
               <w:rPr>
                 <w:rFonts w:ascii="BRH Devanagari Extra" w:hAnsi="BRH Devanagari Extra" w:cs="BRH Devanagari Extra"/>
@@ -5179,23 +6766,35 @@
               </w:rPr>
               <w:t>uÉiÉçiqÉÔ</w:t>
             </w:r>
-            <w:r>
-              <w:rPr>
-                <w:rFonts w:ascii="BRH Malayalam Extra" w:hAnsi="BRH Malayalam Extra" w:cs="BRH Devanagari Extra"/>
-                <w:color w:val="000000"/>
-                <w:sz w:val="32"/>
-                <w:szCs w:val="40"/>
-              </w:rPr>
-              <w:t>–</w:t>
-            </w:r>
-            <w:r>
-              <w:rPr>
-                <w:rFonts w:ascii="BRH Devanagari Extra" w:hAnsi="BRH Devanagari Extra" w:cs="BRH Devanagari Extra"/>
-                <w:color w:val="000000"/>
-                <w:sz w:val="40"/>
-                <w:szCs w:val="40"/>
-              </w:rPr>
-              <w:t xml:space="preserve">iÉqÉç | </w:t>
+            <w:proofErr w:type="spellEnd"/>
+            <w:r>
+              <w:rPr>
+                <w:rFonts w:ascii="BRH Malayalam Extra" w:hAnsi="BRH Malayalam Extra" w:cs="BRH Devanagari Extra"/>
+                <w:color w:val="000000"/>
+                <w:sz w:val="32"/>
+                <w:szCs w:val="40"/>
+              </w:rPr>
+              <w:t>–</w:t>
+            </w:r>
+            <w:proofErr w:type="spellStart"/>
+            <w:r>
+              <w:rPr>
+                <w:rFonts w:ascii="BRH Devanagari Extra" w:hAnsi="BRH Devanagari Extra" w:cs="BRH Devanagari Extra"/>
+                <w:color w:val="000000"/>
+                <w:sz w:val="40"/>
+                <w:szCs w:val="40"/>
+              </w:rPr>
+              <w:t>iÉqÉç</w:t>
+            </w:r>
+            <w:proofErr w:type="spellEnd"/>
+            <w:r>
+              <w:rPr>
+                <w:rFonts w:ascii="BRH Devanagari Extra" w:hAnsi="BRH Devanagari Extra" w:cs="BRH Devanagari Extra"/>
+                <w:color w:val="000000"/>
+                <w:sz w:val="40"/>
+                <w:szCs w:val="40"/>
+              </w:rPr>
+              <w:t xml:space="preserve"> | </w:t>
             </w:r>
           </w:p>
           <w:p>
@@ -5212,6 +6811,7 @@
                 <w:szCs w:val="40"/>
               </w:rPr>
             </w:pPr>
+            <w:proofErr w:type="spellStart"/>
             <w:r>
               <w:rPr>
                 <w:rFonts w:ascii="BRH Devanagari Extra" w:hAnsi="BRH Devanagari Extra" w:cs="BRH Devanagari Extra"/>
@@ -5221,6 +6821,7 @@
               </w:rPr>
               <w:t>rÉÉ</w:t>
             </w:r>
+            <w:proofErr w:type="spellEnd"/>
             <w:r>
               <w:rPr>
                 <w:rFonts w:ascii="BRH Malayalam Extra" w:hAnsi="BRH Malayalam Extra" w:cs="BRH Devanagari Extra"/>
@@ -5248,6 +6849,7 @@
               </w:rPr>
               <w:t>–</w:t>
             </w:r>
+            <w:proofErr w:type="spellStart"/>
             <w:r>
               <w:rPr>
                 <w:rFonts w:ascii="BRH Devanagari Extra" w:hAnsi="BRH Devanagari Extra" w:cs="BRH Devanagari Extra"/>
@@ -5257,15 +6859,17 @@
               </w:rPr>
               <w:t>iÉçiqÉÔ</w:t>
             </w:r>
-            <w:r>
-              <w:rPr>
-                <w:rFonts w:ascii="BRH Malayalam Extra" w:hAnsi="BRH Malayalam Extra" w:cs="BRH Devanagari Extra"/>
-                <w:color w:val="000000"/>
-                <w:sz w:val="32"/>
-                <w:szCs w:val="40"/>
-              </w:rPr>
-              <w:t>–</w:t>
-            </w:r>
+            <w:proofErr w:type="spellEnd"/>
+            <w:r>
+              <w:rPr>
+                <w:rFonts w:ascii="BRH Malayalam Extra" w:hAnsi="BRH Malayalam Extra" w:cs="BRH Devanagari Extra"/>
+                <w:color w:val="000000"/>
+                <w:sz w:val="32"/>
+                <w:szCs w:val="40"/>
+              </w:rPr>
+              <w:t>–</w:t>
+            </w:r>
+            <w:proofErr w:type="spellStart"/>
             <w:r>
               <w:rPr>
                 <w:rFonts w:ascii="BRH Devanagari Extra" w:hAnsi="BRH Devanagari Extra" w:cs="BRH Devanagari Extra"/>
@@ -5284,14 +6888,35 @@
               </w:rPr>
               <w:t>óè</w:t>
             </w:r>
-            <w:r>
-              <w:rPr>
-                <w:rFonts w:ascii="BRH Devanagari Extra" w:hAnsi="BRH Devanagari Extra" w:cs="BRH Devanagari Extra"/>
-                <w:color w:val="000000"/>
-                <w:sz w:val="40"/>
-                <w:szCs w:val="40"/>
-              </w:rPr>
-              <w:t xml:space="preserve"> xÉqÉç |</w:t>
+            <w:proofErr w:type="spellEnd"/>
+            <w:r>
+              <w:rPr>
+                <w:rFonts w:ascii="BRH Devanagari Extra" w:hAnsi="BRH Devanagari Extra" w:cs="BRH Devanagari Extra"/>
+                <w:color w:val="000000"/>
+                <w:sz w:val="40"/>
+                <w:szCs w:val="40"/>
+              </w:rPr>
+              <w:t xml:space="preserve"> </w:t>
+            </w:r>
+            <w:proofErr w:type="spellStart"/>
+            <w:r>
+              <w:rPr>
+                <w:rFonts w:ascii="BRH Devanagari Extra" w:hAnsi="BRH Devanagari Extra" w:cs="BRH Devanagari Extra"/>
+                <w:color w:val="000000"/>
+                <w:sz w:val="40"/>
+                <w:szCs w:val="40"/>
+              </w:rPr>
+              <w:t>xÉqÉç</w:t>
+            </w:r>
+            <w:proofErr w:type="spellEnd"/>
+            <w:r>
+              <w:rPr>
+                <w:rFonts w:ascii="BRH Devanagari Extra" w:hAnsi="BRH Devanagari Extra" w:cs="BRH Devanagari Extra"/>
+                <w:color w:val="000000"/>
+                <w:sz w:val="40"/>
+                <w:szCs w:val="40"/>
+              </w:rPr>
+              <w:t xml:space="preserve"> |</w:t>
             </w:r>
           </w:p>
         </w:tc>
@@ -5439,6 +7064,7 @@
               </w:rPr>
               <w:t>–</w:t>
             </w:r>
+            <w:proofErr w:type="spellStart"/>
             <w:r>
               <w:rPr>
                 <w:rFonts w:ascii="BRH Devanagari Extra" w:hAnsi="BRH Devanagari Extra" w:cs="BRH Devanagari Extra"/>
@@ -5448,6 +7074,7 @@
               </w:rPr>
               <w:t>lkÉå</w:t>
             </w:r>
+            <w:proofErr w:type="spellEnd"/>
             <w:r>
               <w:rPr>
                 <w:rFonts w:ascii="BRH Malayalam Extra" w:hAnsi="BRH Malayalam Extra" w:cs="BRH Devanagari Extra"/>
@@ -5475,24 +7102,36 @@
               </w:rPr>
               <w:t>–</w:t>
             </w:r>
-            <w:r>
-              <w:rPr>
-                <w:rFonts w:ascii="BRH Devanagari Extra" w:hAnsi="BRH Devanagari Extra" w:cs="BRH Devanagari Extra"/>
-                <w:color w:val="000000"/>
-                <w:sz w:val="40"/>
-                <w:szCs w:val="40"/>
-              </w:rPr>
-              <w:t>zÉuÉþÈ | mÉ</w:t>
-            </w:r>
-            <w:r>
-              <w:rPr>
-                <w:rFonts w:ascii="BRH Malayalam Extra" w:hAnsi="BRH Malayalam Extra" w:cs="BRH Devanagari Extra"/>
-                <w:color w:val="000000"/>
-                <w:sz w:val="32"/>
-                <w:szCs w:val="40"/>
-              </w:rPr>
-              <w:t>–</w:t>
-            </w:r>
+            <w:proofErr w:type="spellStart"/>
+            <w:r>
+              <w:rPr>
+                <w:rFonts w:ascii="BRH Devanagari Extra" w:hAnsi="BRH Devanagari Extra" w:cs="BRH Devanagari Extra"/>
+                <w:color w:val="000000"/>
+                <w:sz w:val="40"/>
+                <w:szCs w:val="40"/>
+              </w:rPr>
+              <w:t>zÉuÉþÈ</w:t>
+            </w:r>
+            <w:proofErr w:type="spellEnd"/>
+            <w:r>
+              <w:rPr>
+                <w:rFonts w:ascii="BRH Devanagari Extra" w:hAnsi="BRH Devanagari Extra" w:cs="BRH Devanagari Extra"/>
+                <w:color w:val="000000"/>
+                <w:sz w:val="40"/>
+                <w:szCs w:val="40"/>
+              </w:rPr>
+              <w:t xml:space="preserve"> | mÉ</w:t>
+            </w:r>
+            <w:r>
+              <w:rPr>
+                <w:rFonts w:ascii="BRH Malayalam Extra" w:hAnsi="BRH Malayalam Extra" w:cs="BRH Devanagari Extra"/>
+                <w:color w:val="000000"/>
+                <w:sz w:val="32"/>
+                <w:szCs w:val="40"/>
+              </w:rPr>
+              <w:t>–</w:t>
+            </w:r>
+            <w:proofErr w:type="spellStart"/>
             <w:r>
               <w:rPr>
                 <w:rFonts w:ascii="BRH Devanagari Extra" w:hAnsi="BRH Devanagari Extra" w:cs="BRH Devanagari Extra"/>
@@ -5512,23 +7151,44 @@
               </w:rPr>
               <w:t>åuÉÉå</w:t>
             </w:r>
-            <w:r>
-              <w:rPr>
-                <w:rFonts w:ascii="BRH Malayalam Extra" w:hAnsi="BRH Malayalam Extra" w:cs="BRH Devanagari Extra"/>
-                <w:color w:val="000000"/>
-                <w:sz w:val="32"/>
-                <w:szCs w:val="40"/>
-              </w:rPr>
-              <w:t>–</w:t>
-            </w:r>
-            <w:r>
-              <w:rPr>
-                <w:rFonts w:ascii="BRH Devanagari Extra" w:hAnsi="BRH Devanagari Extra" w:cs="BRH Devanagari Extra"/>
-                <w:color w:val="000000"/>
-                <w:sz w:val="40"/>
-                <w:szCs w:val="40"/>
-              </w:rPr>
-              <w:t xml:space="preserve"> ÌWû | </w:t>
+            <w:proofErr w:type="spellEnd"/>
+            <w:r>
+              <w:rPr>
+                <w:rFonts w:ascii="BRH Malayalam Extra" w:hAnsi="BRH Malayalam Extra" w:cs="BRH Devanagari Extra"/>
+                <w:color w:val="000000"/>
+                <w:sz w:val="32"/>
+                <w:szCs w:val="40"/>
+              </w:rPr>
+              <w:t>–</w:t>
+            </w:r>
+            <w:r>
+              <w:rPr>
+                <w:rFonts w:ascii="BRH Devanagari Extra" w:hAnsi="BRH Devanagari Extra" w:cs="BRH Devanagari Extra"/>
+                <w:color w:val="000000"/>
+                <w:sz w:val="40"/>
+                <w:szCs w:val="40"/>
+              </w:rPr>
+              <w:t xml:space="preserve"> </w:t>
+            </w:r>
+            <w:proofErr w:type="spellStart"/>
+            <w:r>
+              <w:rPr>
+                <w:rFonts w:ascii="BRH Devanagari Extra" w:hAnsi="BRH Devanagari Extra" w:cs="BRH Devanagari Extra"/>
+                <w:color w:val="000000"/>
+                <w:sz w:val="40"/>
+                <w:szCs w:val="40"/>
+              </w:rPr>
+              <w:t>ÌWû</w:t>
+            </w:r>
+            <w:proofErr w:type="spellEnd"/>
+            <w:r>
+              <w:rPr>
+                <w:rFonts w:ascii="BRH Devanagari Extra" w:hAnsi="BRH Devanagari Extra" w:cs="BRH Devanagari Extra"/>
+                <w:color w:val="000000"/>
+                <w:sz w:val="40"/>
+                <w:szCs w:val="40"/>
+              </w:rPr>
+              <w:t xml:space="preserve"> | </w:t>
             </w:r>
           </w:p>
         </w:tc>
@@ -5568,6 +7228,7 @@
               </w:rPr>
               <w:t>–</w:t>
             </w:r>
+            <w:proofErr w:type="spellStart"/>
             <w:r>
               <w:rPr>
                 <w:rFonts w:ascii="BRH Devanagari Extra" w:hAnsi="BRH Devanagari Extra" w:cs="BRH Devanagari Extra"/>
@@ -5577,6 +7238,7 @@
               </w:rPr>
               <w:t>lkÉå</w:t>
             </w:r>
+            <w:proofErr w:type="spellEnd"/>
             <w:r>
               <w:rPr>
                 <w:rFonts w:ascii="BRH Malayalam Extra" w:hAnsi="BRH Malayalam Extra" w:cs="BRH Devanagari Extra"/>
@@ -5604,24 +7266,36 @@
               </w:rPr>
               <w:t>–</w:t>
             </w:r>
-            <w:r>
-              <w:rPr>
-                <w:rFonts w:ascii="BRH Devanagari Extra" w:hAnsi="BRH Devanagari Extra" w:cs="BRH Devanagari Extra"/>
-                <w:color w:val="000000"/>
-                <w:sz w:val="40"/>
-                <w:szCs w:val="40"/>
-              </w:rPr>
-              <w:t>zÉuÉþÈ | mÉ</w:t>
-            </w:r>
-            <w:r>
-              <w:rPr>
-                <w:rFonts w:ascii="BRH Malayalam Extra" w:hAnsi="BRH Malayalam Extra" w:cs="BRH Devanagari Extra"/>
-                <w:color w:val="000000"/>
-                <w:sz w:val="32"/>
-                <w:szCs w:val="40"/>
-              </w:rPr>
-              <w:t>–</w:t>
-            </w:r>
+            <w:proofErr w:type="spellStart"/>
+            <w:r>
+              <w:rPr>
+                <w:rFonts w:ascii="BRH Devanagari Extra" w:hAnsi="BRH Devanagari Extra" w:cs="BRH Devanagari Extra"/>
+                <w:color w:val="000000"/>
+                <w:sz w:val="40"/>
+                <w:szCs w:val="40"/>
+              </w:rPr>
+              <w:t>zÉuÉþÈ</w:t>
+            </w:r>
+            <w:proofErr w:type="spellEnd"/>
+            <w:r>
+              <w:rPr>
+                <w:rFonts w:ascii="BRH Devanagari Extra" w:hAnsi="BRH Devanagari Extra" w:cs="BRH Devanagari Extra"/>
+                <w:color w:val="000000"/>
+                <w:sz w:val="40"/>
+                <w:szCs w:val="40"/>
+              </w:rPr>
+              <w:t xml:space="preserve"> | mÉ</w:t>
+            </w:r>
+            <w:r>
+              <w:rPr>
+                <w:rFonts w:ascii="BRH Malayalam Extra" w:hAnsi="BRH Malayalam Extra" w:cs="BRH Devanagari Extra"/>
+                <w:color w:val="000000"/>
+                <w:sz w:val="32"/>
+                <w:szCs w:val="40"/>
+              </w:rPr>
+              <w:t>–</w:t>
+            </w:r>
+            <w:proofErr w:type="spellStart"/>
             <w:r>
               <w:rPr>
                 <w:rFonts w:ascii="BRH Devanagari Extra" w:hAnsi="BRH Devanagari Extra" w:cs="BRH Devanagari Extra"/>
@@ -5641,23 +7315,44 @@
               </w:rPr>
               <w:t>uÉÉå</w:t>
             </w:r>
-            <w:r>
-              <w:rPr>
-                <w:rFonts w:ascii="BRH Malayalam Extra" w:hAnsi="BRH Malayalam Extra" w:cs="BRH Devanagari Extra"/>
-                <w:color w:val="000000"/>
-                <w:sz w:val="32"/>
-                <w:szCs w:val="40"/>
-              </w:rPr>
-              <w:t>–</w:t>
-            </w:r>
-            <w:r>
-              <w:rPr>
-                <w:rFonts w:ascii="BRH Devanagari Extra" w:hAnsi="BRH Devanagari Extra" w:cs="BRH Devanagari Extra"/>
-                <w:color w:val="000000"/>
-                <w:sz w:val="40"/>
-                <w:szCs w:val="40"/>
-              </w:rPr>
-              <w:t xml:space="preserve"> ÌWû | </w:t>
+            <w:proofErr w:type="spellEnd"/>
+            <w:r>
+              <w:rPr>
+                <w:rFonts w:ascii="BRH Malayalam Extra" w:hAnsi="BRH Malayalam Extra" w:cs="BRH Devanagari Extra"/>
+                <w:color w:val="000000"/>
+                <w:sz w:val="32"/>
+                <w:szCs w:val="40"/>
+              </w:rPr>
+              <w:t>–</w:t>
+            </w:r>
+            <w:r>
+              <w:rPr>
+                <w:rFonts w:ascii="BRH Devanagari Extra" w:hAnsi="BRH Devanagari Extra" w:cs="BRH Devanagari Extra"/>
+                <w:color w:val="000000"/>
+                <w:sz w:val="40"/>
+                <w:szCs w:val="40"/>
+              </w:rPr>
+              <w:t xml:space="preserve"> </w:t>
+            </w:r>
+            <w:proofErr w:type="spellStart"/>
+            <w:r>
+              <w:rPr>
+                <w:rFonts w:ascii="BRH Devanagari Extra" w:hAnsi="BRH Devanagari Extra" w:cs="BRH Devanagari Extra"/>
+                <w:color w:val="000000"/>
+                <w:sz w:val="40"/>
+                <w:szCs w:val="40"/>
+              </w:rPr>
+              <w:t>ÌWû</w:t>
+            </w:r>
+            <w:proofErr w:type="spellEnd"/>
+            <w:r>
+              <w:rPr>
+                <w:rFonts w:ascii="BRH Devanagari Extra" w:hAnsi="BRH Devanagari Extra" w:cs="BRH Devanagari Extra"/>
+                <w:color w:val="000000"/>
+                <w:sz w:val="40"/>
+                <w:szCs w:val="40"/>
+              </w:rPr>
+              <w:t xml:space="preserve"> | </w:t>
             </w:r>
           </w:p>
         </w:tc>
@@ -5748,6 +7443,7 @@
                 <w:sz w:val="28"/>
                 <w:szCs w:val="32"/>
               </w:rPr>
+              <w:lastRenderedPageBreak/>
               <w:t>Panchaati No</w:t>
             </w:r>
             <w:r>
@@ -5787,32 +7483,45 @@
                 <w:szCs w:val="40"/>
               </w:rPr>
             </w:pPr>
-            <w:r>
-              <w:rPr>
-                <w:rFonts w:ascii="BRH Devanagari Extra" w:hAnsi="BRH Devanagari Extra" w:cs="BRH Devanagari Extra"/>
-                <w:color w:val="000000"/>
-                <w:sz w:val="40"/>
-                <w:szCs w:val="40"/>
-              </w:rPr>
+            <w:proofErr w:type="spellStart"/>
+            <w:r>
+              <w:rPr>
+                <w:rFonts w:ascii="BRH Devanagari Extra" w:hAnsi="BRH Devanagari Extra" w:cs="BRH Devanagari Extra"/>
+                <w:color w:val="000000"/>
+                <w:sz w:val="40"/>
+                <w:szCs w:val="40"/>
+              </w:rPr>
+              <w:lastRenderedPageBreak/>
               <w:t>iÉxqÉÉ</w:t>
             </w:r>
-            <w:r>
-              <w:rPr>
-                <w:rFonts w:ascii="BRH Malayalam Extra" w:hAnsi="BRH Malayalam Extra" w:cs="BRH Devanagari Extra"/>
-                <w:color w:val="000000"/>
-                <w:sz w:val="32"/>
-                <w:szCs w:val="40"/>
-              </w:rPr>
-              <w:t>–</w:t>
-            </w:r>
-            <w:r>
-              <w:rPr>
-                <w:rFonts w:ascii="BRH Devanagari Extra" w:hAnsi="BRH Devanagari Extra" w:cs="BRH Devanagari Extra"/>
-                <w:color w:val="000000"/>
-                <w:sz w:val="40"/>
-                <w:szCs w:val="40"/>
-              </w:rPr>
-              <w:t>lÉç lÉÉlÉÉþuÉÏ</w:t>
+            <w:proofErr w:type="spellEnd"/>
+            <w:r>
+              <w:rPr>
+                <w:rFonts w:ascii="BRH Malayalam Extra" w:hAnsi="BRH Malayalam Extra" w:cs="BRH Devanagari Extra"/>
+                <w:color w:val="000000"/>
+                <w:sz w:val="32"/>
+                <w:szCs w:val="40"/>
+              </w:rPr>
+              <w:t>–</w:t>
+            </w:r>
+            <w:r>
+              <w:rPr>
+                <w:rFonts w:ascii="BRH Devanagari Extra" w:hAnsi="BRH Devanagari Extra" w:cs="BRH Devanagari Extra"/>
+                <w:color w:val="000000"/>
+                <w:sz w:val="40"/>
+                <w:szCs w:val="40"/>
+              </w:rPr>
+              <w:t xml:space="preserve">lÉç </w:t>
+            </w:r>
+            <w:proofErr w:type="spellStart"/>
+            <w:r>
+              <w:rPr>
+                <w:rFonts w:ascii="BRH Devanagari Extra" w:hAnsi="BRH Devanagari Extra" w:cs="BRH Devanagari Extra"/>
+                <w:color w:val="000000"/>
+                <w:sz w:val="40"/>
+                <w:szCs w:val="40"/>
+              </w:rPr>
+              <w:t>lÉÉlÉÉþuÉÏ</w:t>
             </w:r>
             <w:r>
               <w:rPr>
@@ -5824,6 +7533,7 @@
               </w:rPr>
               <w:t>rÉÉï</w:t>
             </w:r>
+            <w:proofErr w:type="spellEnd"/>
             <w:r>
               <w:rPr>
                 <w:rFonts w:ascii="BRH Devanagari Extra" w:hAnsi="BRH Devanagari Extra" w:cs="BRH Devanagari Extra"/>
@@ -5848,32 +7558,55 @@
                 <w:szCs w:val="40"/>
               </w:rPr>
             </w:pPr>
-            <w:r>
-              <w:rPr>
-                <w:rFonts w:ascii="BRH Devanagari Extra" w:hAnsi="BRH Devanagari Extra" w:cs="BRH Devanagari Extra"/>
-                <w:color w:val="000000"/>
-                <w:sz w:val="40"/>
-                <w:szCs w:val="40"/>
-              </w:rPr>
-              <w:t>lÉÉlÉÉþuÉÏrÉÉï A</w:t>
-            </w:r>
-            <w:r>
-              <w:rPr>
-                <w:rFonts w:ascii="BRH Malayalam Extra" w:hAnsi="BRH Malayalam Extra" w:cs="BRH Devanagari Extra"/>
-                <w:color w:val="000000"/>
-                <w:sz w:val="32"/>
-                <w:szCs w:val="40"/>
-              </w:rPr>
-              <w:t>–</w:t>
-            </w:r>
-            <w:r>
-              <w:rPr>
-                <w:rFonts w:ascii="BRH Devanagari Extra" w:hAnsi="BRH Devanagari Extra" w:cs="BRH Devanagari Extra"/>
-                <w:color w:val="000000"/>
-                <w:sz w:val="40"/>
-                <w:szCs w:val="40"/>
-              </w:rPr>
-              <w:t xml:space="preserve">XçaÉÑsÉþrÉÈ | </w:t>
+            <w:proofErr w:type="spellStart"/>
+            <w:r>
+              <w:rPr>
+                <w:rFonts w:ascii="BRH Devanagari Extra" w:hAnsi="BRH Devanagari Extra" w:cs="BRH Devanagari Extra"/>
+                <w:color w:val="000000"/>
+                <w:sz w:val="40"/>
+                <w:szCs w:val="40"/>
+              </w:rPr>
+              <w:lastRenderedPageBreak/>
+              <w:t>lÉÉlÉÉþuÉÏrÉÉï</w:t>
+            </w:r>
+            <w:proofErr w:type="spellEnd"/>
+            <w:r>
+              <w:rPr>
+                <w:rFonts w:ascii="BRH Devanagari Extra" w:hAnsi="BRH Devanagari Extra" w:cs="BRH Devanagari Extra"/>
+                <w:color w:val="000000"/>
+                <w:sz w:val="40"/>
+                <w:szCs w:val="40"/>
+              </w:rPr>
+              <w:t xml:space="preserve"> A</w:t>
+            </w:r>
+            <w:r>
+              <w:rPr>
+                <w:rFonts w:ascii="BRH Malayalam Extra" w:hAnsi="BRH Malayalam Extra" w:cs="BRH Devanagari Extra"/>
+                <w:color w:val="000000"/>
+                <w:sz w:val="32"/>
+                <w:szCs w:val="40"/>
+              </w:rPr>
+              <w:t>–</w:t>
+            </w:r>
+            <w:proofErr w:type="spellStart"/>
+            <w:r>
+              <w:rPr>
+                <w:rFonts w:ascii="BRH Devanagari Extra" w:hAnsi="BRH Devanagari Extra" w:cs="BRH Devanagari Extra"/>
+                <w:color w:val="000000"/>
+                <w:sz w:val="40"/>
+                <w:szCs w:val="40"/>
+              </w:rPr>
+              <w:t>XçaÉÑsÉþrÉÈ</w:t>
+            </w:r>
+            <w:proofErr w:type="spellEnd"/>
+            <w:r>
+              <w:rPr>
+                <w:rFonts w:ascii="BRH Devanagari Extra" w:hAnsi="BRH Devanagari Extra" w:cs="BRH Devanagari Extra"/>
+                <w:color w:val="000000"/>
+                <w:sz w:val="40"/>
+                <w:szCs w:val="40"/>
+              </w:rPr>
+              <w:t xml:space="preserve"> | </w:t>
             </w:r>
             <w:r>
               <w:rPr>
@@ -5904,32 +7637,45 @@
                 <w:szCs w:val="40"/>
               </w:rPr>
             </w:pPr>
-            <w:r>
-              <w:rPr>
-                <w:rFonts w:ascii="BRH Devanagari Extra" w:hAnsi="BRH Devanagari Extra" w:cs="BRH Devanagari Extra"/>
-                <w:color w:val="000000"/>
-                <w:sz w:val="40"/>
-                <w:szCs w:val="40"/>
-              </w:rPr>
+            <w:proofErr w:type="spellStart"/>
+            <w:r>
+              <w:rPr>
+                <w:rFonts w:ascii="BRH Devanagari Extra" w:hAnsi="BRH Devanagari Extra" w:cs="BRH Devanagari Extra"/>
+                <w:color w:val="000000"/>
+                <w:sz w:val="40"/>
+                <w:szCs w:val="40"/>
+              </w:rPr>
+              <w:lastRenderedPageBreak/>
               <w:t>iÉxqÉÉ</w:t>
             </w:r>
-            <w:r>
-              <w:rPr>
-                <w:rFonts w:ascii="BRH Malayalam Extra" w:hAnsi="BRH Malayalam Extra" w:cs="BRH Devanagari Extra"/>
-                <w:color w:val="000000"/>
-                <w:sz w:val="32"/>
-                <w:szCs w:val="40"/>
-              </w:rPr>
-              <w:t>–</w:t>
-            </w:r>
-            <w:r>
-              <w:rPr>
-                <w:rFonts w:ascii="BRH Devanagari Extra" w:hAnsi="BRH Devanagari Extra" w:cs="BRH Devanagari Extra"/>
-                <w:color w:val="000000"/>
-                <w:sz w:val="40"/>
-                <w:szCs w:val="40"/>
-              </w:rPr>
-              <w:t>lÉç lÉÉlÉÉþuÉÏ</w:t>
+            <w:proofErr w:type="spellEnd"/>
+            <w:r>
+              <w:rPr>
+                <w:rFonts w:ascii="BRH Malayalam Extra" w:hAnsi="BRH Malayalam Extra" w:cs="BRH Devanagari Extra"/>
+                <w:color w:val="000000"/>
+                <w:sz w:val="32"/>
+                <w:szCs w:val="40"/>
+              </w:rPr>
+              <w:t>–</w:t>
+            </w:r>
+            <w:r>
+              <w:rPr>
+                <w:rFonts w:ascii="BRH Devanagari Extra" w:hAnsi="BRH Devanagari Extra" w:cs="BRH Devanagari Extra"/>
+                <w:color w:val="000000"/>
+                <w:sz w:val="40"/>
+                <w:szCs w:val="40"/>
+              </w:rPr>
+              <w:t xml:space="preserve">lÉç </w:t>
+            </w:r>
+            <w:proofErr w:type="spellStart"/>
+            <w:r>
+              <w:rPr>
+                <w:rFonts w:ascii="BRH Devanagari Extra" w:hAnsi="BRH Devanagari Extra" w:cs="BRH Devanagari Extra"/>
+                <w:color w:val="000000"/>
+                <w:sz w:val="40"/>
+                <w:szCs w:val="40"/>
+              </w:rPr>
+              <w:t>lÉÉlÉÉþuÉÏ</w:t>
             </w:r>
             <w:r>
               <w:rPr>
@@ -5941,6 +7687,7 @@
               </w:rPr>
               <w:t>rÉÉïÈ</w:t>
             </w:r>
+            <w:proofErr w:type="spellEnd"/>
             <w:r>
               <w:rPr>
                 <w:rFonts w:ascii="BRH Devanagari Extra" w:hAnsi="BRH Devanagari Extra" w:cs="BRH Devanagari Extra"/>
@@ -5965,32 +7712,55 @@
                 <w:szCs w:val="40"/>
               </w:rPr>
             </w:pPr>
-            <w:r>
-              <w:rPr>
-                <w:rFonts w:ascii="BRH Devanagari Extra" w:hAnsi="BRH Devanagari Extra" w:cs="BRH Devanagari Extra"/>
-                <w:color w:val="000000"/>
-                <w:sz w:val="40"/>
-                <w:szCs w:val="40"/>
-              </w:rPr>
-              <w:t>lÉÉlÉÉþuÉÏrÉÉï A</w:t>
-            </w:r>
-            <w:r>
-              <w:rPr>
-                <w:rFonts w:ascii="BRH Malayalam Extra" w:hAnsi="BRH Malayalam Extra" w:cs="BRH Devanagari Extra"/>
-                <w:color w:val="000000"/>
-                <w:sz w:val="32"/>
-                <w:szCs w:val="40"/>
-              </w:rPr>
-              <w:t>–</w:t>
-            </w:r>
-            <w:r>
-              <w:rPr>
-                <w:rFonts w:ascii="BRH Devanagari Extra" w:hAnsi="BRH Devanagari Extra" w:cs="BRH Devanagari Extra"/>
-                <w:color w:val="000000"/>
-                <w:sz w:val="40"/>
-                <w:szCs w:val="40"/>
-              </w:rPr>
-              <w:t xml:space="preserve">XçaÉÑsÉþrÉÈ | </w:t>
+            <w:proofErr w:type="spellStart"/>
+            <w:r>
+              <w:rPr>
+                <w:rFonts w:ascii="BRH Devanagari Extra" w:hAnsi="BRH Devanagari Extra" w:cs="BRH Devanagari Extra"/>
+                <w:color w:val="000000"/>
+                <w:sz w:val="40"/>
+                <w:szCs w:val="40"/>
+              </w:rPr>
+              <w:lastRenderedPageBreak/>
+              <w:t>lÉÉlÉÉþuÉÏrÉÉï</w:t>
+            </w:r>
+            <w:proofErr w:type="spellEnd"/>
+            <w:r>
+              <w:rPr>
+                <w:rFonts w:ascii="BRH Devanagari Extra" w:hAnsi="BRH Devanagari Extra" w:cs="BRH Devanagari Extra"/>
+                <w:color w:val="000000"/>
+                <w:sz w:val="40"/>
+                <w:szCs w:val="40"/>
+              </w:rPr>
+              <w:t xml:space="preserve"> A</w:t>
+            </w:r>
+            <w:r>
+              <w:rPr>
+                <w:rFonts w:ascii="BRH Malayalam Extra" w:hAnsi="BRH Malayalam Extra" w:cs="BRH Devanagari Extra"/>
+                <w:color w:val="000000"/>
+                <w:sz w:val="32"/>
+                <w:szCs w:val="40"/>
+              </w:rPr>
+              <w:t>–</w:t>
+            </w:r>
+            <w:proofErr w:type="spellStart"/>
+            <w:r>
+              <w:rPr>
+                <w:rFonts w:ascii="BRH Devanagari Extra" w:hAnsi="BRH Devanagari Extra" w:cs="BRH Devanagari Extra"/>
+                <w:color w:val="000000"/>
+                <w:sz w:val="40"/>
+                <w:szCs w:val="40"/>
+              </w:rPr>
+              <w:t>XçaÉÑsÉþrÉÈ</w:t>
+            </w:r>
+            <w:proofErr w:type="spellEnd"/>
+            <w:r>
+              <w:rPr>
+                <w:rFonts w:ascii="BRH Devanagari Extra" w:hAnsi="BRH Devanagari Extra" w:cs="BRH Devanagari Extra"/>
+                <w:color w:val="000000"/>
+                <w:sz w:val="40"/>
+                <w:szCs w:val="40"/>
+              </w:rPr>
+              <w:t xml:space="preserve"> | </w:t>
             </w:r>
             <w:r>
               <w:rPr>
@@ -6129,6 +7899,7 @@
                 <w:szCs w:val="40"/>
               </w:rPr>
             </w:pPr>
+            <w:proofErr w:type="spellStart"/>
             <w:r>
               <w:rPr>
                 <w:rFonts w:ascii="BRH Devanagari Extra" w:hAnsi="BRH Devanagari Extra" w:cs="BRH Devanagari Extra"/>
@@ -6148,51 +7919,94 @@
               </w:rPr>
               <w:t>£üÉ</w:t>
             </w:r>
-            <w:r>
-              <w:rPr>
-                <w:rFonts w:ascii="BRH Devanagari Extra" w:hAnsi="BRH Devanagari Extra" w:cs="BRH Devanagari Extra"/>
-                <w:color w:val="000000"/>
-                <w:sz w:val="40"/>
-                <w:szCs w:val="40"/>
-              </w:rPr>
-              <w:t xml:space="preserve"> CÌiÉ</w:t>
-            </w:r>
-            <w:r>
-              <w:rPr>
-                <w:rFonts w:ascii="BRH Malayalam Extra" w:hAnsi="BRH Malayalam Extra" w:cs="BRH Devanagari Extra"/>
-                <w:color w:val="000000"/>
-                <w:sz w:val="32"/>
-                <w:szCs w:val="40"/>
-              </w:rPr>
-              <w:t>–</w:t>
-            </w:r>
-            <w:r>
-              <w:rPr>
-                <w:rFonts w:ascii="BRH Devanagari Extra" w:hAnsi="BRH Devanagari Extra" w:cs="BRH Devanagari Extra"/>
-                <w:color w:val="000000"/>
-                <w:sz w:val="40"/>
-                <w:szCs w:val="40"/>
-              </w:rPr>
-              <w:t xml:space="preserve"> ÌuÉ - pÉ</w:t>
-            </w:r>
-            <w:r>
-              <w:rPr>
-                <w:rFonts w:ascii="BRH Malayalam Extra" w:hAnsi="BRH Malayalam Extra" w:cs="BRH Devanagari Extra"/>
-                <w:color w:val="000000"/>
-                <w:sz w:val="32"/>
-                <w:szCs w:val="40"/>
-              </w:rPr>
-              <w:t>–</w:t>
-            </w:r>
-            <w:r>
-              <w:rPr>
-                <w:rFonts w:ascii="BRH Devanagari Extra" w:hAnsi="BRH Devanagari Extra" w:cs="BRH Devanagari Extra"/>
-                <w:color w:val="000000"/>
-                <w:sz w:val="40"/>
-                <w:szCs w:val="40"/>
-              </w:rPr>
-              <w:t>£üÉ</w:t>
-            </w:r>
+            <w:proofErr w:type="spellEnd"/>
+            <w:r>
+              <w:rPr>
+                <w:rFonts w:ascii="BRH Devanagari Extra" w:hAnsi="BRH Devanagari Extra" w:cs="BRH Devanagari Extra"/>
+                <w:color w:val="000000"/>
+                <w:sz w:val="40"/>
+                <w:szCs w:val="40"/>
+              </w:rPr>
+              <w:t xml:space="preserve"> </w:t>
+            </w:r>
+            <w:proofErr w:type="spellStart"/>
+            <w:r>
+              <w:rPr>
+                <w:rFonts w:ascii="BRH Devanagari Extra" w:hAnsi="BRH Devanagari Extra" w:cs="BRH Devanagari Extra"/>
+                <w:color w:val="000000"/>
+                <w:sz w:val="40"/>
+                <w:szCs w:val="40"/>
+              </w:rPr>
+              <w:t>CÌiÉ</w:t>
+            </w:r>
+            <w:proofErr w:type="spellEnd"/>
+            <w:r>
+              <w:rPr>
+                <w:rFonts w:ascii="BRH Malayalam Extra" w:hAnsi="BRH Malayalam Extra" w:cs="BRH Devanagari Extra"/>
+                <w:color w:val="000000"/>
+                <w:sz w:val="32"/>
+                <w:szCs w:val="40"/>
+              </w:rPr>
+              <w:t>–</w:t>
+            </w:r>
+            <w:r>
+              <w:rPr>
+                <w:rFonts w:ascii="BRH Devanagari Extra" w:hAnsi="BRH Devanagari Extra" w:cs="BRH Devanagari Extra"/>
+                <w:color w:val="000000"/>
+                <w:sz w:val="40"/>
+                <w:szCs w:val="40"/>
+              </w:rPr>
+              <w:t xml:space="preserve"> </w:t>
+            </w:r>
+            <w:proofErr w:type="spellStart"/>
+            <w:r>
+              <w:rPr>
+                <w:rFonts w:ascii="BRH Devanagari Extra" w:hAnsi="BRH Devanagari Extra" w:cs="BRH Devanagari Extra"/>
+                <w:color w:val="000000"/>
+                <w:sz w:val="40"/>
+                <w:szCs w:val="40"/>
+              </w:rPr>
+              <w:t>ÌuÉ</w:t>
+            </w:r>
+            <w:proofErr w:type="spellEnd"/>
+            <w:r>
+              <w:rPr>
+                <w:rFonts w:ascii="BRH Devanagari Extra" w:hAnsi="BRH Devanagari Extra" w:cs="BRH Devanagari Extra"/>
+                <w:color w:val="000000"/>
+                <w:sz w:val="40"/>
+                <w:szCs w:val="40"/>
+              </w:rPr>
+              <w:t xml:space="preserve"> - pÉ</w:t>
+            </w:r>
+            <w:r>
+              <w:rPr>
+                <w:rFonts w:ascii="BRH Malayalam Extra" w:hAnsi="BRH Malayalam Extra" w:cs="BRH Devanagari Extra"/>
+                <w:color w:val="000000"/>
+                <w:sz w:val="32"/>
+                <w:szCs w:val="40"/>
+              </w:rPr>
+              <w:t>–</w:t>
+            </w:r>
+            <w:r>
+              <w:rPr>
+                <w:rFonts w:ascii="BRH Devanagari Extra" w:hAnsi="BRH Devanagari Extra" w:cs="BRH Devanagari Extra"/>
+                <w:color w:val="000000"/>
+                <w:sz w:val="40"/>
+                <w:szCs w:val="40"/>
+              </w:rPr>
+              <w:t>£</w:t>
+            </w:r>
+            <w:proofErr w:type="spellStart"/>
+            <w:r>
+              <w:rPr>
+                <w:rFonts w:ascii="BRH Devanagari Extra" w:hAnsi="BRH Devanagari Extra" w:cs="BRH Devanagari Extra"/>
+                <w:color w:val="000000"/>
+                <w:sz w:val="40"/>
+                <w:szCs w:val="40"/>
+              </w:rPr>
+              <w:t>üÉ</w:t>
+            </w:r>
+            <w:proofErr w:type="spellEnd"/>
             <w:r>
               <w:rPr>
                 <w:rFonts w:ascii="BRH Malayalam Extra" w:hAnsi="BRH Malayalam Extra" w:cs="BRH Devanagari Extra"/>
@@ -6227,6 +8041,7 @@
                 <w:szCs w:val="40"/>
               </w:rPr>
             </w:pPr>
+            <w:proofErr w:type="spellStart"/>
             <w:r>
               <w:rPr>
                 <w:rFonts w:ascii="BRH Devanagari Extra" w:hAnsi="BRH Devanagari Extra" w:cs="BRH Devanagari Extra"/>
@@ -6246,6 +8061,7 @@
               </w:rPr>
               <w:t>£üÉ</w:t>
             </w:r>
+            <w:proofErr w:type="spellEnd"/>
             <w:r>
               <w:rPr>
                 <w:rFonts w:ascii="BRH Malayalam Extra" w:hAnsi="BRH Malayalam Extra" w:cs="BRH Devanagari Extra"/>
@@ -6263,44 +8079,86 @@
                 <w:sz w:val="40"/>
                 <w:szCs w:val="40"/>
               </w:rPr>
-              <w:t xml:space="preserve"> CÌiÉ</w:t>
-            </w:r>
-            <w:r>
-              <w:rPr>
-                <w:rFonts w:ascii="BRH Malayalam Extra" w:hAnsi="BRH Malayalam Extra" w:cs="BRH Devanagari Extra"/>
-                <w:color w:val="000000"/>
-                <w:sz w:val="32"/>
-                <w:szCs w:val="40"/>
-              </w:rPr>
-              <w:t>–</w:t>
-            </w:r>
-            <w:r>
-              <w:rPr>
-                <w:rFonts w:ascii="BRH Devanagari Extra" w:hAnsi="BRH Devanagari Extra" w:cs="BRH Devanagari Extra"/>
-                <w:color w:val="000000"/>
-                <w:sz w:val="40"/>
-                <w:szCs w:val="40"/>
-              </w:rPr>
-              <w:t xml:space="preserve"> ÌuÉ - pÉ</w:t>
-            </w:r>
-            <w:r>
-              <w:rPr>
-                <w:rFonts w:ascii="BRH Malayalam Extra" w:hAnsi="BRH Malayalam Extra" w:cs="BRH Devanagari Extra"/>
-                <w:color w:val="000000"/>
-                <w:sz w:val="32"/>
-                <w:szCs w:val="40"/>
-              </w:rPr>
-              <w:t>–</w:t>
-            </w:r>
-            <w:r>
-              <w:rPr>
-                <w:rFonts w:ascii="BRH Devanagari Extra" w:hAnsi="BRH Devanagari Extra" w:cs="BRH Devanagari Extra"/>
-                <w:color w:val="000000"/>
-                <w:sz w:val="40"/>
-                <w:szCs w:val="40"/>
-              </w:rPr>
-              <w:t>£üÉ</w:t>
-            </w:r>
+              <w:t xml:space="preserve"> </w:t>
+            </w:r>
+            <w:proofErr w:type="spellStart"/>
+            <w:r>
+              <w:rPr>
+                <w:rFonts w:ascii="BRH Devanagari Extra" w:hAnsi="BRH Devanagari Extra" w:cs="BRH Devanagari Extra"/>
+                <w:color w:val="000000"/>
+                <w:sz w:val="40"/>
+                <w:szCs w:val="40"/>
+              </w:rPr>
+              <w:t>CÌiÉ</w:t>
+            </w:r>
+            <w:proofErr w:type="spellEnd"/>
+            <w:r>
+              <w:rPr>
+                <w:rFonts w:ascii="BRH Malayalam Extra" w:hAnsi="BRH Malayalam Extra" w:cs="BRH Devanagari Extra"/>
+                <w:color w:val="000000"/>
+                <w:sz w:val="32"/>
+                <w:szCs w:val="40"/>
+              </w:rPr>
+              <w:t>–</w:t>
+            </w:r>
+            <w:r>
+              <w:rPr>
+                <w:rFonts w:ascii="BRH Devanagari Extra" w:hAnsi="BRH Devanagari Extra" w:cs="BRH Devanagari Extra"/>
+                <w:color w:val="000000"/>
+                <w:sz w:val="40"/>
+                <w:szCs w:val="40"/>
+              </w:rPr>
+              <w:t xml:space="preserve"> </w:t>
+            </w:r>
+            <w:proofErr w:type="spellStart"/>
+            <w:r>
+              <w:rPr>
+                <w:rFonts w:ascii="BRH Devanagari Extra" w:hAnsi="BRH Devanagari Extra" w:cs="BRH Devanagari Extra"/>
+                <w:color w:val="000000"/>
+                <w:sz w:val="40"/>
+                <w:szCs w:val="40"/>
+              </w:rPr>
+              <w:t>ÌuÉ</w:t>
+            </w:r>
+            <w:proofErr w:type="spellEnd"/>
+            <w:r>
+              <w:rPr>
+                <w:rFonts w:ascii="BRH Devanagari Extra" w:hAnsi="BRH Devanagari Extra" w:cs="BRH Devanagari Extra"/>
+                <w:color w:val="000000"/>
+                <w:sz w:val="40"/>
+                <w:szCs w:val="40"/>
+              </w:rPr>
+              <w:t xml:space="preserve"> - pÉ</w:t>
+            </w:r>
+            <w:r>
+              <w:rPr>
+                <w:rFonts w:ascii="BRH Malayalam Extra" w:hAnsi="BRH Malayalam Extra" w:cs="BRH Devanagari Extra"/>
+                <w:color w:val="000000"/>
+                <w:sz w:val="32"/>
+                <w:szCs w:val="40"/>
+              </w:rPr>
+              <w:t>–</w:t>
+            </w:r>
+            <w:r>
+              <w:rPr>
+                <w:rFonts w:ascii="BRH Devanagari Extra" w:hAnsi="BRH Devanagari Extra" w:cs="BRH Devanagari Extra"/>
+                <w:color w:val="000000"/>
+                <w:sz w:val="40"/>
+                <w:szCs w:val="40"/>
+              </w:rPr>
+              <w:t>£</w:t>
+            </w:r>
+            <w:proofErr w:type="spellStart"/>
+            <w:r>
+              <w:rPr>
+                <w:rFonts w:ascii="BRH Devanagari Extra" w:hAnsi="BRH Devanagari Extra" w:cs="BRH Devanagari Extra"/>
+                <w:color w:val="000000"/>
+                <w:sz w:val="40"/>
+                <w:szCs w:val="40"/>
+              </w:rPr>
+              <w:t>üÉ</w:t>
+            </w:r>
+            <w:proofErr w:type="spellEnd"/>
             <w:r>
               <w:rPr>
                 <w:rFonts w:ascii="BRH Malayalam Extra" w:hAnsi="BRH Malayalam Extra" w:cs="BRH Devanagari Extra"/>
@@ -6443,6 +8301,7 @@
                 <w:szCs w:val="40"/>
               </w:rPr>
             </w:pPr>
+            <w:proofErr w:type="spellStart"/>
             <w:r>
               <w:rPr>
                 <w:rFonts w:ascii="BRH Devanagari Extra" w:hAnsi="BRH Devanagari Extra" w:cs="BRH Devanagari Extra"/>
@@ -6452,24 +8311,46 @@
               </w:rPr>
               <w:t>xÉÉåqÉ</w:t>
             </w:r>
-            <w:r>
-              <w:rPr>
-                <w:rFonts w:ascii="BRH Malayalam Extra" w:hAnsi="BRH Malayalam Extra" w:cs="BRH Devanagari Extra"/>
-                <w:color w:val="000000"/>
-                <w:sz w:val="32"/>
-                <w:szCs w:val="40"/>
-              </w:rPr>
-              <w:t>–</w:t>
-            </w:r>
-            <w:r>
-              <w:rPr>
-                <w:rFonts w:ascii="BRH Devanagari Extra" w:hAnsi="BRH Devanagari Extra" w:cs="BRH Devanagari Extra"/>
-                <w:color w:val="000000"/>
-                <w:sz w:val="40"/>
-                <w:szCs w:val="40"/>
-              </w:rPr>
-              <w:t xml:space="preserve">È xrÉÉiÉç | </w:t>
-            </w:r>
+            <w:proofErr w:type="spellEnd"/>
+            <w:r>
+              <w:rPr>
+                <w:rFonts w:ascii="BRH Malayalam Extra" w:hAnsi="BRH Malayalam Extra" w:cs="BRH Devanagari Extra"/>
+                <w:color w:val="000000"/>
+                <w:sz w:val="32"/>
+                <w:szCs w:val="40"/>
+              </w:rPr>
+              <w:t>–</w:t>
+            </w:r>
+            <w:r>
+              <w:rPr>
+                <w:rFonts w:ascii="BRH Devanagari Extra" w:hAnsi="BRH Devanagari Extra" w:cs="BRH Devanagari Extra"/>
+                <w:color w:val="000000"/>
+                <w:sz w:val="40"/>
+                <w:szCs w:val="40"/>
+              </w:rPr>
+              <w:t xml:space="preserve">È </w:t>
+            </w:r>
+            <w:proofErr w:type="spellStart"/>
+            <w:r>
+              <w:rPr>
+                <w:rFonts w:ascii="BRH Devanagari Extra" w:hAnsi="BRH Devanagari Extra" w:cs="BRH Devanagari Extra"/>
+                <w:color w:val="000000"/>
+                <w:sz w:val="40"/>
+                <w:szCs w:val="40"/>
+              </w:rPr>
+              <w:t>xrÉÉiÉç</w:t>
+            </w:r>
+            <w:proofErr w:type="spellEnd"/>
+            <w:r>
+              <w:rPr>
+                <w:rFonts w:ascii="BRH Devanagari Extra" w:hAnsi="BRH Devanagari Extra" w:cs="BRH Devanagari Extra"/>
+                <w:color w:val="000000"/>
+                <w:sz w:val="40"/>
+                <w:szCs w:val="40"/>
+              </w:rPr>
+              <w:t xml:space="preserve"> | </w:t>
+            </w:r>
+            <w:proofErr w:type="spellStart"/>
             <w:r>
               <w:rPr>
                 <w:rFonts w:ascii="BRH Devanagari Extra" w:hAnsi="BRH Devanagari Extra" w:cs="BRH Devanagari Extra"/>
@@ -6480,23 +8361,44 @@
               </w:rPr>
               <w:t>xrÉÉ</w:t>
             </w:r>
-            <w:r>
-              <w:rPr>
-                <w:rFonts w:ascii="BRH Malayalam Extra" w:hAnsi="BRH Malayalam Extra" w:cs="BRH Devanagari Extra"/>
-                <w:color w:val="000000"/>
-                <w:sz w:val="32"/>
-                <w:szCs w:val="40"/>
-              </w:rPr>
-              <w:t>–</w:t>
-            </w:r>
-            <w:r>
-              <w:rPr>
-                <w:rFonts w:ascii="BRH Devanagari Extra" w:hAnsi="BRH Devanagari Extra" w:cs="BRH Devanagari Extra"/>
-                <w:color w:val="000000"/>
-                <w:sz w:val="40"/>
-                <w:szCs w:val="40"/>
-              </w:rPr>
-              <w:t>Sè rÉÉuÉþliÉqÉç |</w:t>
+            <w:proofErr w:type="spellEnd"/>
+            <w:r>
+              <w:rPr>
+                <w:rFonts w:ascii="BRH Malayalam Extra" w:hAnsi="BRH Malayalam Extra" w:cs="BRH Devanagari Extra"/>
+                <w:color w:val="000000"/>
+                <w:sz w:val="32"/>
+                <w:szCs w:val="40"/>
+              </w:rPr>
+              <w:t>–</w:t>
+            </w:r>
+            <w:r>
+              <w:rPr>
+                <w:rFonts w:ascii="BRH Devanagari Extra" w:hAnsi="BRH Devanagari Extra" w:cs="BRH Devanagari Extra"/>
+                <w:color w:val="000000"/>
+                <w:sz w:val="40"/>
+                <w:szCs w:val="40"/>
+              </w:rPr>
+              <w:t xml:space="preserve">Sè </w:t>
+            </w:r>
+            <w:proofErr w:type="spellStart"/>
+            <w:r>
+              <w:rPr>
+                <w:rFonts w:ascii="BRH Devanagari Extra" w:hAnsi="BRH Devanagari Extra" w:cs="BRH Devanagari Extra"/>
+                <w:color w:val="000000"/>
+                <w:sz w:val="40"/>
+                <w:szCs w:val="40"/>
+              </w:rPr>
+              <w:t>rÉÉuÉþliÉqÉç</w:t>
+            </w:r>
+            <w:proofErr w:type="spellEnd"/>
+            <w:r>
+              <w:rPr>
+                <w:rFonts w:ascii="BRH Devanagari Extra" w:hAnsi="BRH Devanagari Extra" w:cs="BRH Devanagari Extra"/>
+                <w:color w:val="000000"/>
+                <w:sz w:val="40"/>
+                <w:szCs w:val="40"/>
+              </w:rPr>
+              <w:t xml:space="preserve"> |</w:t>
             </w:r>
           </w:p>
         </w:tc>
@@ -6518,6 +8420,7 @@
                 <w:szCs w:val="40"/>
               </w:rPr>
             </w:pPr>
+            <w:proofErr w:type="spellStart"/>
             <w:r>
               <w:rPr>
                 <w:rFonts w:ascii="BRH Devanagari Extra" w:hAnsi="BRH Devanagari Extra" w:cs="BRH Devanagari Extra"/>
@@ -6527,24 +8430,46 @@
               </w:rPr>
               <w:t>xÉÉåqÉ</w:t>
             </w:r>
-            <w:r>
-              <w:rPr>
-                <w:rFonts w:ascii="BRH Malayalam Extra" w:hAnsi="BRH Malayalam Extra" w:cs="BRH Devanagari Extra"/>
-                <w:color w:val="000000"/>
-                <w:sz w:val="32"/>
-                <w:szCs w:val="40"/>
-              </w:rPr>
-              <w:t>–</w:t>
-            </w:r>
-            <w:r>
-              <w:rPr>
-                <w:rFonts w:ascii="BRH Devanagari Extra" w:hAnsi="BRH Devanagari Extra" w:cs="BRH Devanagari Extra"/>
-                <w:color w:val="000000"/>
-                <w:sz w:val="40"/>
-                <w:szCs w:val="40"/>
-              </w:rPr>
-              <w:t xml:space="preserve">È xrÉÉiÉç | </w:t>
-            </w:r>
+            <w:proofErr w:type="spellEnd"/>
+            <w:r>
+              <w:rPr>
+                <w:rFonts w:ascii="BRH Malayalam Extra" w:hAnsi="BRH Malayalam Extra" w:cs="BRH Devanagari Extra"/>
+                <w:color w:val="000000"/>
+                <w:sz w:val="32"/>
+                <w:szCs w:val="40"/>
+              </w:rPr>
+              <w:t>–</w:t>
+            </w:r>
+            <w:r>
+              <w:rPr>
+                <w:rFonts w:ascii="BRH Devanagari Extra" w:hAnsi="BRH Devanagari Extra" w:cs="BRH Devanagari Extra"/>
+                <w:color w:val="000000"/>
+                <w:sz w:val="40"/>
+                <w:szCs w:val="40"/>
+              </w:rPr>
+              <w:t xml:space="preserve">È </w:t>
+            </w:r>
+            <w:proofErr w:type="spellStart"/>
+            <w:r>
+              <w:rPr>
+                <w:rFonts w:ascii="BRH Devanagari Extra" w:hAnsi="BRH Devanagari Extra" w:cs="BRH Devanagari Extra"/>
+                <w:color w:val="000000"/>
+                <w:sz w:val="40"/>
+                <w:szCs w:val="40"/>
+              </w:rPr>
+              <w:t>xrÉÉiÉç</w:t>
+            </w:r>
+            <w:proofErr w:type="spellEnd"/>
+            <w:r>
+              <w:rPr>
+                <w:rFonts w:ascii="BRH Devanagari Extra" w:hAnsi="BRH Devanagari Extra" w:cs="BRH Devanagari Extra"/>
+                <w:color w:val="000000"/>
+                <w:sz w:val="40"/>
+                <w:szCs w:val="40"/>
+              </w:rPr>
+              <w:t xml:space="preserve"> | </w:t>
+            </w:r>
+            <w:proofErr w:type="spellStart"/>
             <w:r>
               <w:rPr>
                 <w:rFonts w:ascii="BRH Devanagari Extra" w:hAnsi="BRH Devanagari Extra" w:cs="BRH Devanagari Extra"/>
@@ -6562,7 +8487,37 @@
                 <w:sz w:val="40"/>
                 <w:szCs w:val="40"/>
               </w:rPr>
-              <w:t>Sè rÉÉuÉþliÉqÉç |</w:t>
+              <w:t>Sè</w:t>
+            </w:r>
+            <w:proofErr w:type="spellEnd"/>
+            <w:r>
+              <w:rPr>
+                <w:rFonts w:ascii="BRH Devanagari Extra" w:hAnsi="BRH Devanagari Extra" w:cs="BRH Devanagari Extra"/>
+                <w:color w:val="000000"/>
+                <w:sz w:val="40"/>
+                <w:szCs w:val="40"/>
+              </w:rPr>
+              <w:t xml:space="preserve"> </w:t>
+            </w:r>
+            <w:proofErr w:type="spellStart"/>
+            <w:r>
+              <w:rPr>
+                <w:rFonts w:ascii="BRH Devanagari Extra" w:hAnsi="BRH Devanagari Extra" w:cs="BRH Devanagari Extra"/>
+                <w:color w:val="000000"/>
+                <w:sz w:val="40"/>
+                <w:szCs w:val="40"/>
+              </w:rPr>
+              <w:t>rÉÉuÉþliÉqÉç</w:t>
+            </w:r>
+            <w:proofErr w:type="spellEnd"/>
+            <w:r>
+              <w:rPr>
+                <w:rFonts w:ascii="BRH Devanagari Extra" w:hAnsi="BRH Devanagari Extra" w:cs="BRH Devanagari Extra"/>
+                <w:color w:val="000000"/>
+                <w:sz w:val="40"/>
+                <w:szCs w:val="40"/>
+              </w:rPr>
+              <w:t xml:space="preserve"> |</w:t>
             </w:r>
           </w:p>
         </w:tc>
@@ -6596,7 +8551,29 @@
           <w:szCs w:val="40"/>
           <w:lang w:val="en-IN" w:eastAsia="en-IN"/>
         </w:rPr>
-        <w:t xml:space="preserve">"zlÉ" </w:t>
+        <w:t>"</w:t>
+      </w:r>
+      <w:proofErr w:type="spellStart"/>
+      <w:r>
+        <w:rPr>
+          <w:rFonts w:ascii="BRH Devanagari" w:hAnsi="BRH Devanagari" w:cs="BRH Devanagari"/>
+          <w:color w:val="000000"/>
+          <w:sz w:val="40"/>
+          <w:szCs w:val="40"/>
+          <w:lang w:val="en-IN" w:eastAsia="en-IN"/>
+        </w:rPr>
+        <w:t>zlÉ</w:t>
+      </w:r>
+      <w:proofErr w:type="spellEnd"/>
+      <w:r>
+        <w:rPr>
+          <w:rFonts w:ascii="BRH Devanagari" w:hAnsi="BRH Devanagari" w:cs="BRH Devanagari"/>
+          <w:color w:val="000000"/>
+          <w:sz w:val="40"/>
+          <w:szCs w:val="40"/>
+          <w:lang w:val="en-IN" w:eastAsia="en-IN"/>
+        </w:rPr>
+        <w:t xml:space="preserve">" </w:t>
       </w:r>
       <w:r>
         <w:rPr>
@@ -6604,7 +8581,16 @@
           <w:bCs/>
           <w:sz w:val="32"/>
         </w:rPr>
-        <w:t>replaced with</w:t>
+        <w:t xml:space="preserve">replaced </w:t>
+      </w:r>
+      <w:proofErr w:type="gramStart"/>
+      <w:r>
+        <w:rPr>
+          <w:b/>
+          <w:bCs/>
+          <w:sz w:val="32"/>
+        </w:rPr>
+        <w:t>with</w:t>
       </w:r>
       <w:r>
         <w:rPr>
@@ -6626,6 +8612,8 @@
         </w:rPr>
         <w:t>"</w:t>
       </w:r>
+      <w:proofErr w:type="spellStart"/>
+      <w:proofErr w:type="gramEnd"/>
       <w:r>
         <w:rPr>
           <w:rFonts w:ascii="BRH Devanagari" w:hAnsi="BRH Devanagari" w:cs="BRH Devanagari"/>
@@ -6637,6 +8625,7 @@
         </w:rPr>
         <w:t>zgÉ</w:t>
       </w:r>
+      <w:proofErr w:type="spellEnd"/>
       <w:r>
         <w:rPr>
           <w:rFonts w:ascii="BRH Devanagari" w:hAnsi="BRH Devanagari" w:cs="BRH Devanagari"/>
@@ -7933,7 +9922,7 @@
   <w:style w:type="paragraph" w:default="1" w:styleId="Normal">
     <w:name w:val="Normal"/>
     <w:qFormat/>
-    <w:rsid w:val="00076C05"/>
+    <w:rsid w:val="00C262F6"/>
     <w:pPr>
       <w:spacing w:before="120" w:line="276" w:lineRule="auto"/>
     </w:pPr>

</xml_diff>